<commit_message>
update confidence interal and heatmaps
</commit_message>
<xml_diff>
--- a/Paper/MLWA/Corrections/MLWA_Manuscript_12May25.docx
+++ b/Paper/MLWA/Corrections/MLWA_Manuscript_12May25.docx
@@ -23354,7 +23354,34 @@
                 <w:sz w:val="20"/>
                 <w:szCs w:val="20"/>
               </w:rPr>
-              <w:t>Accuracy WHO system 5th edition</w:t>
+              <w:t xml:space="preserve">   </w:t>
+            </w:r>
+            <w:r>
+              <w:rPr>
+                <w:b/>
+                <w:bCs/>
+                <w:sz w:val="20"/>
+                <w:szCs w:val="20"/>
+              </w:rPr>
+              <w:t xml:space="preserve">Accuracy WHO system </w:t>
+            </w:r>
+            <w:r>
+              <w:rPr>
+                <w:b/>
+                <w:bCs/>
+                <w:sz w:val="20"/>
+                <w:szCs w:val="20"/>
+              </w:rPr>
+              <w:br/>
+            </w:r>
+            <w:r>
+              <w:rPr>
+                <w:b/>
+                <w:bCs/>
+                <w:sz w:val="20"/>
+                <w:szCs w:val="20"/>
+              </w:rPr>
+              <w:t>5th edition</w:t>
             </w:r>
           </w:p>
         </w:tc>
@@ -23371,6 +23398,15 @@
                 <w:szCs w:val="20"/>
               </w:rPr>
             </w:pPr>
+            <w:r>
+              <w:rPr>
+                <w:b/>
+                <w:bCs/>
+                <w:sz w:val="20"/>
+                <w:szCs w:val="20"/>
+              </w:rPr>
+              <w:t xml:space="preserve">     </w:t>
+            </w:r>
             <w:r>
               <w:rPr>
                 <w:b/>
@@ -25215,7 +25251,7 @@
             <w:tcBorders>
               <w:top w:val="single" w:sz="4" w:space="0" w:color="auto"/>
               <w:left w:val="single" w:sz="4" w:space="0" w:color="auto"/>
-              <w:bottom w:val="single" w:sz="4" w:space="0" w:color="auto"/>
+              <w:bottom w:val="nil"/>
               <w:right w:val="single" w:sz="4" w:space="0" w:color="auto"/>
             </w:tcBorders>
             <w:tcMar>
@@ -25241,6 +25277,728 @@
             <w:tcW w:w="2430" w:type="dxa"/>
             <w:tcBorders>
               <w:top w:val="single" w:sz="4" w:space="0" w:color="auto"/>
+              <w:left w:val="single" w:sz="4" w:space="0" w:color="auto"/>
+              <w:bottom w:val="nil"/>
+            </w:tcBorders>
+            <w:tcMar>
+              <w:left w:w="576" w:type="dxa"/>
+              <w:right w:w="576" w:type="dxa"/>
+            </w:tcMar>
+            <w:vAlign w:val="center"/>
+          </w:tcPr>
+          <w:p>
+            <w:pPr>
+              <w:jc w:val="center"/>
+              <w:rPr>
+                <w:highlight w:val="white"/>
+              </w:rPr>
+            </w:pPr>
+            <w:r>
+              <w:rPr>
+                <w:highlight w:val="white"/>
+              </w:rPr>
+              <w:t>0.000</w:t>
+            </w:r>
+          </w:p>
+        </w:tc>
+        <w:tc>
+          <w:tcPr>
+            <w:tcW w:w="2790" w:type="dxa"/>
+            <w:tcBorders>
+              <w:top w:val="single" w:sz="4" w:space="0" w:color="auto"/>
+              <w:bottom w:val="nil"/>
+              <w:right w:val="single" w:sz="4" w:space="0" w:color="auto"/>
+            </w:tcBorders>
+            <w:tcMar>
+              <w:left w:w="576" w:type="dxa"/>
+              <w:right w:w="576" w:type="dxa"/>
+            </w:tcMar>
+            <w:vAlign w:val="center"/>
+          </w:tcPr>
+          <w:p>
+            <w:pPr>
+              <w:jc w:val="center"/>
+              <w:rPr>
+                <w:highlight w:val="white"/>
+              </w:rPr>
+            </w:pPr>
+            <w:r>
+              <w:rPr>
+                <w:highlight w:val="white"/>
+              </w:rPr>
+              <w:t>0.339</w:t>
+            </w:r>
+          </w:p>
+        </w:tc>
+        <w:tc>
+          <w:tcPr>
+            <w:tcW w:w="2700" w:type="dxa"/>
+            <w:tcBorders>
+              <w:top w:val="single" w:sz="4" w:space="0" w:color="auto"/>
+              <w:left w:val="single" w:sz="4" w:space="0" w:color="auto"/>
+              <w:bottom w:val="nil"/>
+            </w:tcBorders>
+            <w:tcMar>
+              <w:left w:w="576" w:type="dxa"/>
+              <w:right w:w="576" w:type="dxa"/>
+            </w:tcMar>
+            <w:vAlign w:val="center"/>
+          </w:tcPr>
+          <w:p>
+            <w:pPr>
+              <w:jc w:val="center"/>
+              <w:rPr>
+                <w:highlight w:val="white"/>
+              </w:rPr>
+            </w:pPr>
+            <w:r>
+              <w:rPr>
+                <w:highlight w:val="white"/>
+              </w:rPr>
+              <w:t>0.000</w:t>
+            </w:r>
+          </w:p>
+        </w:tc>
+        <w:tc>
+          <w:tcPr>
+            <w:tcW w:w="2970" w:type="dxa"/>
+            <w:tcBorders>
+              <w:top w:val="single" w:sz="4" w:space="0" w:color="auto"/>
+              <w:bottom w:val="nil"/>
+              <w:right w:val="single" w:sz="4" w:space="0" w:color="auto"/>
+            </w:tcBorders>
+            <w:tcMar>
+              <w:left w:w="576" w:type="dxa"/>
+              <w:right w:w="576" w:type="dxa"/>
+            </w:tcMar>
+            <w:vAlign w:val="center"/>
+          </w:tcPr>
+          <w:p>
+            <w:pPr>
+              <w:jc w:val="center"/>
+              <w:rPr>
+                <w:highlight w:val="white"/>
+              </w:rPr>
+            </w:pPr>
+            <w:r>
+              <w:rPr>
+                <w:highlight w:val="white"/>
+              </w:rPr>
+              <w:t>0.394</w:t>
+            </w:r>
+          </w:p>
+        </w:tc>
+      </w:tr>
+      <w:tr>
+        <w:trPr>
+          <w:trHeight w:val="431"/>
+        </w:trPr>
+        <w:tc>
+          <w:tcPr>
+            <w:tcW w:w="1980" w:type="dxa"/>
+            <w:tcBorders>
+              <w:top w:val="nil"/>
+              <w:left w:val="single" w:sz="4" w:space="0" w:color="auto"/>
+              <w:bottom w:val="nil"/>
+              <w:right w:val="single" w:sz="4" w:space="0" w:color="auto"/>
+            </w:tcBorders>
+            <w:tcMar>
+              <w:left w:w="576" w:type="dxa"/>
+              <w:right w:w="576" w:type="dxa"/>
+            </w:tcMar>
+            <w:vAlign w:val="center"/>
+          </w:tcPr>
+          <w:p>
+            <w:pPr>
+              <w:jc w:val="center"/>
+            </w:pPr>
+            <w:r>
+              <w:t>1</w:t>
+            </w:r>
+            <w:r>
+              <w:rPr>
+                <w:vertAlign w:val="superscript"/>
+              </w:rPr>
+              <w:t>st</w:t>
+            </w:r>
+            <w:r>
+              <w:t xml:space="preserve"> Quartile</w:t>
+            </w:r>
+          </w:p>
+        </w:tc>
+        <w:tc>
+          <w:tcPr>
+            <w:tcW w:w="2430" w:type="dxa"/>
+            <w:tcBorders>
+              <w:top w:val="nil"/>
+              <w:left w:val="single" w:sz="4" w:space="0" w:color="auto"/>
+              <w:bottom w:val="nil"/>
+            </w:tcBorders>
+            <w:tcMar>
+              <w:left w:w="576" w:type="dxa"/>
+              <w:right w:w="576" w:type="dxa"/>
+            </w:tcMar>
+            <w:vAlign w:val="center"/>
+          </w:tcPr>
+          <w:p>
+            <w:pPr>
+              <w:jc w:val="center"/>
+              <w:rPr>
+                <w:highlight w:val="white"/>
+              </w:rPr>
+            </w:pPr>
+            <w:r>
+              <w:rPr>
+                <w:highlight w:val="white"/>
+              </w:rPr>
+              <w:t>0.586</w:t>
+            </w:r>
+          </w:p>
+        </w:tc>
+        <w:tc>
+          <w:tcPr>
+            <w:tcW w:w="2790" w:type="dxa"/>
+            <w:tcBorders>
+              <w:top w:val="nil"/>
+              <w:bottom w:val="nil"/>
+              <w:right w:val="single" w:sz="4" w:space="0" w:color="auto"/>
+            </w:tcBorders>
+            <w:tcMar>
+              <w:left w:w="576" w:type="dxa"/>
+              <w:right w:w="576" w:type="dxa"/>
+            </w:tcMar>
+            <w:vAlign w:val="center"/>
+          </w:tcPr>
+          <w:p>
+            <w:pPr>
+              <w:jc w:val="center"/>
+              <w:rPr>
+                <w:highlight w:val="white"/>
+              </w:rPr>
+            </w:pPr>
+            <w:r>
+              <w:rPr>
+                <w:highlight w:val="white"/>
+              </w:rPr>
+              <w:t>0.764</w:t>
+            </w:r>
+          </w:p>
+        </w:tc>
+        <w:tc>
+          <w:tcPr>
+            <w:tcW w:w="2700" w:type="dxa"/>
+            <w:tcBorders>
+              <w:top w:val="nil"/>
+              <w:left w:val="single" w:sz="4" w:space="0" w:color="auto"/>
+              <w:bottom w:val="nil"/>
+            </w:tcBorders>
+            <w:tcMar>
+              <w:left w:w="576" w:type="dxa"/>
+              <w:right w:w="576" w:type="dxa"/>
+            </w:tcMar>
+            <w:vAlign w:val="center"/>
+          </w:tcPr>
+          <w:p>
+            <w:pPr>
+              <w:jc w:val="center"/>
+              <w:rPr>
+                <w:highlight w:val="white"/>
+              </w:rPr>
+            </w:pPr>
+            <w:r>
+              <w:rPr>
+                <w:highlight w:val="white"/>
+              </w:rPr>
+              <w:t>0.564</w:t>
+            </w:r>
+          </w:p>
+        </w:tc>
+        <w:tc>
+          <w:tcPr>
+            <w:tcW w:w="2970" w:type="dxa"/>
+            <w:tcBorders>
+              <w:top w:val="nil"/>
+              <w:bottom w:val="nil"/>
+              <w:right w:val="single" w:sz="4" w:space="0" w:color="auto"/>
+            </w:tcBorders>
+            <w:tcMar>
+              <w:left w:w="576" w:type="dxa"/>
+              <w:right w:w="576" w:type="dxa"/>
+            </w:tcMar>
+            <w:vAlign w:val="center"/>
+          </w:tcPr>
+          <w:p>
+            <w:pPr>
+              <w:jc w:val="center"/>
+              <w:rPr>
+                <w:highlight w:val="white"/>
+              </w:rPr>
+            </w:pPr>
+            <w:r>
+              <w:rPr>
+                <w:highlight w:val="white"/>
+              </w:rPr>
+              <w:t>0.733</w:t>
+            </w:r>
+          </w:p>
+        </w:tc>
+      </w:tr>
+      <w:tr>
+        <w:trPr>
+          <w:trHeight w:val="431"/>
+        </w:trPr>
+        <w:tc>
+          <w:tcPr>
+            <w:tcW w:w="1980" w:type="dxa"/>
+            <w:tcBorders>
+              <w:top w:val="nil"/>
+              <w:left w:val="single" w:sz="4" w:space="0" w:color="auto"/>
+              <w:bottom w:val="nil"/>
+              <w:right w:val="single" w:sz="4" w:space="0" w:color="auto"/>
+            </w:tcBorders>
+            <w:tcMar>
+              <w:left w:w="576" w:type="dxa"/>
+              <w:right w:w="576" w:type="dxa"/>
+            </w:tcMar>
+            <w:vAlign w:val="center"/>
+          </w:tcPr>
+          <w:p>
+            <w:pPr>
+              <w:jc w:val="center"/>
+            </w:pPr>
+            <w:r>
+              <w:t>Median</w:t>
+            </w:r>
+          </w:p>
+        </w:tc>
+        <w:tc>
+          <w:tcPr>
+            <w:tcW w:w="2430" w:type="dxa"/>
+            <w:tcBorders>
+              <w:top w:val="nil"/>
+              <w:left w:val="single" w:sz="4" w:space="0" w:color="auto"/>
+              <w:bottom w:val="nil"/>
+            </w:tcBorders>
+            <w:tcMar>
+              <w:left w:w="576" w:type="dxa"/>
+              <w:right w:w="576" w:type="dxa"/>
+            </w:tcMar>
+            <w:vAlign w:val="center"/>
+          </w:tcPr>
+          <w:p>
+            <w:pPr>
+              <w:jc w:val="center"/>
+              <w:rPr>
+                <w:highlight w:val="white"/>
+              </w:rPr>
+            </w:pPr>
+            <w:r>
+              <w:rPr>
+                <w:highlight w:val="white"/>
+              </w:rPr>
+              <w:t>0.696</w:t>
+            </w:r>
+          </w:p>
+        </w:tc>
+        <w:tc>
+          <w:tcPr>
+            <w:tcW w:w="2790" w:type="dxa"/>
+            <w:tcBorders>
+              <w:top w:val="nil"/>
+              <w:bottom w:val="nil"/>
+              <w:right w:val="single" w:sz="4" w:space="0" w:color="auto"/>
+            </w:tcBorders>
+            <w:tcMar>
+              <w:left w:w="576" w:type="dxa"/>
+              <w:right w:w="576" w:type="dxa"/>
+            </w:tcMar>
+            <w:vAlign w:val="center"/>
+          </w:tcPr>
+          <w:p>
+            <w:pPr>
+              <w:jc w:val="center"/>
+              <w:rPr>
+                <w:highlight w:val="white"/>
+              </w:rPr>
+            </w:pPr>
+            <w:r>
+              <w:rPr>
+                <w:highlight w:val="white"/>
+              </w:rPr>
+              <w:t>0.841</w:t>
+            </w:r>
+          </w:p>
+        </w:tc>
+        <w:tc>
+          <w:tcPr>
+            <w:tcW w:w="2700" w:type="dxa"/>
+            <w:tcBorders>
+              <w:top w:val="nil"/>
+              <w:left w:val="single" w:sz="4" w:space="0" w:color="auto"/>
+              <w:bottom w:val="nil"/>
+            </w:tcBorders>
+            <w:tcMar>
+              <w:left w:w="576" w:type="dxa"/>
+              <w:right w:w="576" w:type="dxa"/>
+            </w:tcMar>
+            <w:vAlign w:val="center"/>
+          </w:tcPr>
+          <w:p>
+            <w:pPr>
+              <w:jc w:val="center"/>
+              <w:rPr>
+                <w:highlight w:val="white"/>
+              </w:rPr>
+            </w:pPr>
+            <w:r>
+              <w:rPr>
+                <w:highlight w:val="white"/>
+              </w:rPr>
+              <w:t>0.687</w:t>
+            </w:r>
+          </w:p>
+        </w:tc>
+        <w:tc>
+          <w:tcPr>
+            <w:tcW w:w="2970" w:type="dxa"/>
+            <w:tcBorders>
+              <w:top w:val="nil"/>
+              <w:bottom w:val="nil"/>
+              <w:right w:val="single" w:sz="4" w:space="0" w:color="auto"/>
+            </w:tcBorders>
+            <w:tcMar>
+              <w:left w:w="576" w:type="dxa"/>
+              <w:right w:w="576" w:type="dxa"/>
+            </w:tcMar>
+            <w:vAlign w:val="center"/>
+          </w:tcPr>
+          <w:p>
+            <w:pPr>
+              <w:jc w:val="center"/>
+              <w:rPr>
+                <w:highlight w:val="white"/>
+              </w:rPr>
+            </w:pPr>
+            <w:r>
+              <w:rPr>
+                <w:highlight w:val="white"/>
+              </w:rPr>
+              <w:t>0.825</w:t>
+            </w:r>
+          </w:p>
+        </w:tc>
+      </w:tr>
+      <w:tr>
+        <w:trPr>
+          <w:trHeight w:val="464"/>
+        </w:trPr>
+        <w:tc>
+          <w:tcPr>
+            <w:tcW w:w="1980" w:type="dxa"/>
+            <w:tcBorders>
+              <w:top w:val="nil"/>
+              <w:left w:val="single" w:sz="4" w:space="0" w:color="auto"/>
+              <w:bottom w:val="nil"/>
+              <w:right w:val="single" w:sz="4" w:space="0" w:color="auto"/>
+            </w:tcBorders>
+            <w:tcMar>
+              <w:left w:w="576" w:type="dxa"/>
+              <w:right w:w="576" w:type="dxa"/>
+            </w:tcMar>
+            <w:vAlign w:val="center"/>
+          </w:tcPr>
+          <w:p>
+            <w:pPr>
+              <w:jc w:val="center"/>
+              <w:rPr>
+                <w:highlight w:val="white"/>
+              </w:rPr>
+            </w:pPr>
+            <w:r>
+              <w:t>Mean</w:t>
+            </w:r>
+          </w:p>
+        </w:tc>
+        <w:tc>
+          <w:tcPr>
+            <w:tcW w:w="2430" w:type="dxa"/>
+            <w:tcBorders>
+              <w:top w:val="nil"/>
+              <w:left w:val="single" w:sz="4" w:space="0" w:color="auto"/>
+              <w:bottom w:val="nil"/>
+            </w:tcBorders>
+            <w:tcMar>
+              <w:left w:w="576" w:type="dxa"/>
+              <w:right w:w="576" w:type="dxa"/>
+            </w:tcMar>
+            <w:vAlign w:val="center"/>
+          </w:tcPr>
+          <w:p>
+            <w:pPr>
+              <w:jc w:val="center"/>
+              <w:rPr>
+                <w:highlight w:val="white"/>
+              </w:rPr>
+            </w:pPr>
+            <w:r>
+              <w:rPr>
+                <w:highlight w:val="white"/>
+              </w:rPr>
+              <w:t>0.666</w:t>
+            </w:r>
+          </w:p>
+        </w:tc>
+        <w:tc>
+          <w:tcPr>
+            <w:tcW w:w="2790" w:type="dxa"/>
+            <w:tcBorders>
+              <w:top w:val="nil"/>
+              <w:bottom w:val="nil"/>
+              <w:right w:val="single" w:sz="4" w:space="0" w:color="auto"/>
+            </w:tcBorders>
+            <w:tcMar>
+              <w:left w:w="576" w:type="dxa"/>
+              <w:right w:w="576" w:type="dxa"/>
+            </w:tcMar>
+            <w:vAlign w:val="center"/>
+          </w:tcPr>
+          <w:p>
+            <w:pPr>
+              <w:jc w:val="center"/>
+              <w:rPr>
+                <w:highlight w:val="white"/>
+              </w:rPr>
+            </w:pPr>
+            <w:r>
+              <w:rPr>
+                <w:highlight w:val="white"/>
+              </w:rPr>
+              <w:t>0.826</w:t>
+            </w:r>
+          </w:p>
+        </w:tc>
+        <w:tc>
+          <w:tcPr>
+            <w:tcW w:w="2700" w:type="dxa"/>
+            <w:tcBorders>
+              <w:top w:val="nil"/>
+              <w:left w:val="single" w:sz="4" w:space="0" w:color="auto"/>
+              <w:bottom w:val="nil"/>
+            </w:tcBorders>
+            <w:tcMar>
+              <w:left w:w="576" w:type="dxa"/>
+              <w:right w:w="576" w:type="dxa"/>
+            </w:tcMar>
+            <w:vAlign w:val="center"/>
+          </w:tcPr>
+          <w:p>
+            <w:pPr>
+              <w:jc w:val="center"/>
+              <w:rPr>
+                <w:highlight w:val="white"/>
+              </w:rPr>
+            </w:pPr>
+            <w:r>
+              <w:rPr>
+                <w:highlight w:val="white"/>
+              </w:rPr>
+              <w:t>0.647</w:t>
+            </w:r>
+          </w:p>
+        </w:tc>
+        <w:tc>
+          <w:tcPr>
+            <w:tcW w:w="2970" w:type="dxa"/>
+            <w:tcBorders>
+              <w:top w:val="nil"/>
+              <w:bottom w:val="nil"/>
+              <w:right w:val="single" w:sz="4" w:space="0" w:color="auto"/>
+            </w:tcBorders>
+            <w:tcMar>
+              <w:left w:w="576" w:type="dxa"/>
+              <w:right w:w="576" w:type="dxa"/>
+            </w:tcMar>
+            <w:vAlign w:val="center"/>
+          </w:tcPr>
+          <w:p>
+            <w:pPr>
+              <w:jc w:val="center"/>
+              <w:rPr>
+                <w:highlight w:val="white"/>
+              </w:rPr>
+            </w:pPr>
+            <w:r>
+              <w:rPr>
+                <w:highlight w:val="white"/>
+              </w:rPr>
+              <w:t>0.811</w:t>
+            </w:r>
+          </w:p>
+        </w:tc>
+      </w:tr>
+      <w:tr>
+        <w:trPr>
+          <w:trHeight w:val="431"/>
+        </w:trPr>
+        <w:tc>
+          <w:tcPr>
+            <w:tcW w:w="1980" w:type="dxa"/>
+            <w:tcBorders>
+              <w:top w:val="nil"/>
+              <w:left w:val="single" w:sz="4" w:space="0" w:color="auto"/>
+              <w:bottom w:val="nil"/>
+              <w:right w:val="single" w:sz="4" w:space="0" w:color="auto"/>
+            </w:tcBorders>
+            <w:tcMar>
+              <w:left w:w="576" w:type="dxa"/>
+              <w:right w:w="576" w:type="dxa"/>
+            </w:tcMar>
+            <w:vAlign w:val="center"/>
+          </w:tcPr>
+          <w:p>
+            <w:pPr>
+              <w:jc w:val="center"/>
+            </w:pPr>
+            <w:r>
+              <w:t>3</w:t>
+            </w:r>
+            <w:r>
+              <w:rPr>
+                <w:vertAlign w:val="superscript"/>
+              </w:rPr>
+              <w:t>rd</w:t>
+            </w:r>
+            <w:r>
+              <w:t xml:space="preserve"> Quartile</w:t>
+            </w:r>
+          </w:p>
+        </w:tc>
+        <w:tc>
+          <w:tcPr>
+            <w:tcW w:w="2430" w:type="dxa"/>
+            <w:tcBorders>
+              <w:top w:val="nil"/>
+              <w:left w:val="single" w:sz="4" w:space="0" w:color="auto"/>
+              <w:bottom w:val="nil"/>
+            </w:tcBorders>
+            <w:tcMar>
+              <w:left w:w="576" w:type="dxa"/>
+              <w:right w:w="576" w:type="dxa"/>
+            </w:tcMar>
+            <w:vAlign w:val="center"/>
+          </w:tcPr>
+          <w:p>
+            <w:pPr>
+              <w:jc w:val="center"/>
+              <w:rPr>
+                <w:highlight w:val="white"/>
+              </w:rPr>
+            </w:pPr>
+            <w:r>
+              <w:rPr>
+                <w:highlight w:val="white"/>
+              </w:rPr>
+              <w:t>0.804</w:t>
+            </w:r>
+          </w:p>
+        </w:tc>
+        <w:tc>
+          <w:tcPr>
+            <w:tcW w:w="2790" w:type="dxa"/>
+            <w:tcBorders>
+              <w:top w:val="nil"/>
+              <w:bottom w:val="nil"/>
+              <w:right w:val="single" w:sz="4" w:space="0" w:color="auto"/>
+            </w:tcBorders>
+            <w:tcMar>
+              <w:left w:w="576" w:type="dxa"/>
+              <w:right w:w="576" w:type="dxa"/>
+            </w:tcMar>
+            <w:vAlign w:val="center"/>
+          </w:tcPr>
+          <w:p>
+            <w:pPr>
+              <w:jc w:val="center"/>
+              <w:rPr>
+                <w:highlight w:val="white"/>
+              </w:rPr>
+            </w:pPr>
+            <w:r>
+              <w:rPr>
+                <w:highlight w:val="white"/>
+              </w:rPr>
+              <w:t>0.908</w:t>
+            </w:r>
+          </w:p>
+        </w:tc>
+        <w:tc>
+          <w:tcPr>
+            <w:tcW w:w="2700" w:type="dxa"/>
+            <w:tcBorders>
+              <w:top w:val="nil"/>
+              <w:left w:val="single" w:sz="4" w:space="0" w:color="auto"/>
+              <w:bottom w:val="nil"/>
+            </w:tcBorders>
+            <w:tcMar>
+              <w:left w:w="576" w:type="dxa"/>
+              <w:right w:w="576" w:type="dxa"/>
+            </w:tcMar>
+            <w:vAlign w:val="center"/>
+          </w:tcPr>
+          <w:p>
+            <w:pPr>
+              <w:jc w:val="center"/>
+              <w:rPr>
+                <w:highlight w:val="white"/>
+              </w:rPr>
+            </w:pPr>
+            <w:r>
+              <w:rPr>
+                <w:highlight w:val="white"/>
+              </w:rPr>
+              <w:t>0.802</w:t>
+            </w:r>
+          </w:p>
+        </w:tc>
+        <w:tc>
+          <w:tcPr>
+            <w:tcW w:w="2970" w:type="dxa"/>
+            <w:tcBorders>
+              <w:top w:val="nil"/>
+              <w:bottom w:val="nil"/>
+              <w:right w:val="single" w:sz="4" w:space="0" w:color="auto"/>
+            </w:tcBorders>
+            <w:tcMar>
+              <w:left w:w="576" w:type="dxa"/>
+              <w:right w:w="576" w:type="dxa"/>
+            </w:tcMar>
+            <w:vAlign w:val="center"/>
+          </w:tcPr>
+          <w:p>
+            <w:pPr>
+              <w:jc w:val="center"/>
+              <w:rPr>
+                <w:highlight w:val="white"/>
+              </w:rPr>
+            </w:pPr>
+            <w:r>
+              <w:rPr>
+                <w:highlight w:val="white"/>
+              </w:rPr>
+              <w:t>0.897</w:t>
+            </w:r>
+          </w:p>
+        </w:tc>
+      </w:tr>
+      <w:tr>
+        <w:trPr>
+          <w:trHeight w:val="431"/>
+        </w:trPr>
+        <w:tc>
+          <w:tcPr>
+            <w:tcW w:w="1980" w:type="dxa"/>
+            <w:tcBorders>
+              <w:top w:val="nil"/>
               <w:left w:val="single" w:sz="4" w:space="0" w:color="auto"/>
               <w:bottom w:val="single" w:sz="4" w:space="0" w:color="auto"/>
               <w:right w:val="single" w:sz="4" w:space="0" w:color="auto"/>
@@ -25254,6 +26012,29 @@
           <w:p>
             <w:pPr>
               <w:jc w:val="center"/>
+            </w:pPr>
+            <w:r>
+              <w:t>Maximum</w:t>
+            </w:r>
+          </w:p>
+        </w:tc>
+        <w:tc>
+          <w:tcPr>
+            <w:tcW w:w="2430" w:type="dxa"/>
+            <w:tcBorders>
+              <w:top w:val="nil"/>
+              <w:left w:val="single" w:sz="4" w:space="0" w:color="auto"/>
+              <w:bottom w:val="single" w:sz="4" w:space="0" w:color="auto"/>
+            </w:tcBorders>
+            <w:tcMar>
+              <w:left w:w="576" w:type="dxa"/>
+              <w:right w:w="576" w:type="dxa"/>
+            </w:tcMar>
+            <w:vAlign w:val="center"/>
+          </w:tcPr>
+          <w:p>
+            <w:pPr>
+              <w:jc w:val="center"/>
               <w:rPr>
                 <w:highlight w:val="white"/>
               </w:rPr>
@@ -25262,7 +26043,7 @@
               <w:rPr>
                 <w:highlight w:val="white"/>
               </w:rPr>
-              <w:t>0.000</w:t>
+              <w:t>1.010</w:t>
             </w:r>
           </w:p>
         </w:tc>
@@ -25270,8 +26051,7 @@
           <w:tcPr>
             <w:tcW w:w="2790" w:type="dxa"/>
             <w:tcBorders>
-              <w:top w:val="single" w:sz="4" w:space="0" w:color="auto"/>
-              <w:left w:val="single" w:sz="4" w:space="0" w:color="auto"/>
+              <w:top w:val="nil"/>
               <w:bottom w:val="single" w:sz="4" w:space="0" w:color="auto"/>
               <w:right w:val="single" w:sz="4" w:space="0" w:color="auto"/>
             </w:tcBorders>
@@ -25292,7 +26072,7 @@
               <w:rPr>
                 <w:highlight w:val="white"/>
               </w:rPr>
-              <w:t>0.339</w:t>
+              <w:t>1.090</w:t>
             </w:r>
           </w:p>
         </w:tc>
@@ -25300,10 +26080,9 @@
           <w:tcPr>
             <w:tcW w:w="2700" w:type="dxa"/>
             <w:tcBorders>
-              <w:top w:val="single" w:sz="4" w:space="0" w:color="auto"/>
+              <w:top w:val="nil"/>
               <w:left w:val="single" w:sz="4" w:space="0" w:color="auto"/>
               <w:bottom w:val="single" w:sz="4" w:space="0" w:color="auto"/>
-              <w:right w:val="single" w:sz="4" w:space="0" w:color="auto"/>
             </w:tcBorders>
             <w:tcMar>
               <w:left w:w="576" w:type="dxa"/>
@@ -25322,7 +26101,7 @@
               <w:rPr>
                 <w:highlight w:val="white"/>
               </w:rPr>
-              <w:t>0.000</w:t>
+              <w:t>1.080</w:t>
             </w:r>
           </w:p>
         </w:tc>
@@ -25330,774 +26109,7 @@
           <w:tcPr>
             <w:tcW w:w="2970" w:type="dxa"/>
             <w:tcBorders>
-              <w:top w:val="single" w:sz="4" w:space="0" w:color="auto"/>
-              <w:left w:val="single" w:sz="4" w:space="0" w:color="auto"/>
-              <w:bottom w:val="single" w:sz="4" w:space="0" w:color="auto"/>
-              <w:right w:val="single" w:sz="4" w:space="0" w:color="auto"/>
-            </w:tcBorders>
-            <w:tcMar>
-              <w:left w:w="576" w:type="dxa"/>
-              <w:right w:w="576" w:type="dxa"/>
-            </w:tcMar>
-            <w:vAlign w:val="center"/>
-          </w:tcPr>
-          <w:p>
-            <w:pPr>
-              <w:jc w:val="center"/>
-              <w:rPr>
-                <w:highlight w:val="white"/>
-              </w:rPr>
-            </w:pPr>
-            <w:r>
-              <w:rPr>
-                <w:highlight w:val="white"/>
-              </w:rPr>
-              <w:t>0.394</w:t>
-            </w:r>
-          </w:p>
-        </w:tc>
-      </w:tr>
-      <w:tr>
-        <w:trPr>
-          <w:trHeight w:val="431"/>
-        </w:trPr>
-        <w:tc>
-          <w:tcPr>
-            <w:tcW w:w="1980" w:type="dxa"/>
-            <w:tcBorders>
-              <w:top w:val="single" w:sz="4" w:space="0" w:color="auto"/>
-              <w:left w:val="single" w:sz="4" w:space="0" w:color="auto"/>
-              <w:bottom w:val="single" w:sz="4" w:space="0" w:color="auto"/>
-              <w:right w:val="single" w:sz="4" w:space="0" w:color="auto"/>
-            </w:tcBorders>
-            <w:tcMar>
-              <w:left w:w="576" w:type="dxa"/>
-              <w:right w:w="576" w:type="dxa"/>
-            </w:tcMar>
-            <w:vAlign w:val="center"/>
-          </w:tcPr>
-          <w:p>
-            <w:pPr>
-              <w:jc w:val="center"/>
-            </w:pPr>
-            <w:r>
-              <w:t>1</w:t>
-            </w:r>
-            <w:r>
-              <w:rPr>
-                <w:vertAlign w:val="superscript"/>
-              </w:rPr>
-              <w:t>st</w:t>
-            </w:r>
-            <w:r>
-              <w:t xml:space="preserve"> Quartile</w:t>
-            </w:r>
-          </w:p>
-        </w:tc>
-        <w:tc>
-          <w:tcPr>
-            <w:tcW w:w="2430" w:type="dxa"/>
-            <w:tcBorders>
-              <w:top w:val="single" w:sz="4" w:space="0" w:color="auto"/>
-              <w:left w:val="single" w:sz="4" w:space="0" w:color="auto"/>
-              <w:bottom w:val="single" w:sz="4" w:space="0" w:color="auto"/>
-              <w:right w:val="single" w:sz="4" w:space="0" w:color="auto"/>
-            </w:tcBorders>
-            <w:tcMar>
-              <w:left w:w="576" w:type="dxa"/>
-              <w:right w:w="576" w:type="dxa"/>
-            </w:tcMar>
-            <w:vAlign w:val="center"/>
-          </w:tcPr>
-          <w:p>
-            <w:pPr>
-              <w:jc w:val="center"/>
-              <w:rPr>
-                <w:highlight w:val="white"/>
-              </w:rPr>
-            </w:pPr>
-            <w:r>
-              <w:rPr>
-                <w:highlight w:val="white"/>
-              </w:rPr>
-              <w:t>0.586</w:t>
-            </w:r>
-          </w:p>
-        </w:tc>
-        <w:tc>
-          <w:tcPr>
-            <w:tcW w:w="2790" w:type="dxa"/>
-            <w:tcBorders>
-              <w:top w:val="single" w:sz="4" w:space="0" w:color="auto"/>
-              <w:left w:val="single" w:sz="4" w:space="0" w:color="auto"/>
-              <w:bottom w:val="single" w:sz="4" w:space="0" w:color="auto"/>
-              <w:right w:val="single" w:sz="4" w:space="0" w:color="auto"/>
-            </w:tcBorders>
-            <w:tcMar>
-              <w:left w:w="576" w:type="dxa"/>
-              <w:right w:w="576" w:type="dxa"/>
-            </w:tcMar>
-            <w:vAlign w:val="center"/>
-          </w:tcPr>
-          <w:p>
-            <w:pPr>
-              <w:jc w:val="center"/>
-              <w:rPr>
-                <w:highlight w:val="white"/>
-              </w:rPr>
-            </w:pPr>
-            <w:r>
-              <w:rPr>
-                <w:highlight w:val="white"/>
-              </w:rPr>
-              <w:t>0.764</w:t>
-            </w:r>
-          </w:p>
-        </w:tc>
-        <w:tc>
-          <w:tcPr>
-            <w:tcW w:w="2700" w:type="dxa"/>
-            <w:tcBorders>
-              <w:top w:val="single" w:sz="4" w:space="0" w:color="auto"/>
-              <w:left w:val="single" w:sz="4" w:space="0" w:color="auto"/>
-              <w:bottom w:val="single" w:sz="4" w:space="0" w:color="auto"/>
-              <w:right w:val="single" w:sz="4" w:space="0" w:color="auto"/>
-            </w:tcBorders>
-            <w:tcMar>
-              <w:left w:w="576" w:type="dxa"/>
-              <w:right w:w="576" w:type="dxa"/>
-            </w:tcMar>
-            <w:vAlign w:val="center"/>
-          </w:tcPr>
-          <w:p>
-            <w:pPr>
-              <w:jc w:val="center"/>
-              <w:rPr>
-                <w:highlight w:val="white"/>
-              </w:rPr>
-            </w:pPr>
-            <w:r>
-              <w:rPr>
-                <w:highlight w:val="white"/>
-              </w:rPr>
-              <w:t>0.564</w:t>
-            </w:r>
-          </w:p>
-        </w:tc>
-        <w:tc>
-          <w:tcPr>
-            <w:tcW w:w="2970" w:type="dxa"/>
-            <w:tcBorders>
-              <w:top w:val="single" w:sz="4" w:space="0" w:color="auto"/>
-              <w:left w:val="single" w:sz="4" w:space="0" w:color="auto"/>
-              <w:bottom w:val="single" w:sz="4" w:space="0" w:color="auto"/>
-              <w:right w:val="single" w:sz="4" w:space="0" w:color="auto"/>
-            </w:tcBorders>
-            <w:tcMar>
-              <w:left w:w="576" w:type="dxa"/>
-              <w:right w:w="576" w:type="dxa"/>
-            </w:tcMar>
-            <w:vAlign w:val="center"/>
-          </w:tcPr>
-          <w:p>
-            <w:pPr>
-              <w:jc w:val="center"/>
-              <w:rPr>
-                <w:highlight w:val="white"/>
-              </w:rPr>
-            </w:pPr>
-            <w:r>
-              <w:rPr>
-                <w:highlight w:val="white"/>
-              </w:rPr>
-              <w:t>0.733</w:t>
-            </w:r>
-          </w:p>
-        </w:tc>
-      </w:tr>
-      <w:tr>
-        <w:trPr>
-          <w:trHeight w:val="431"/>
-        </w:trPr>
-        <w:tc>
-          <w:tcPr>
-            <w:tcW w:w="1980" w:type="dxa"/>
-            <w:tcBorders>
-              <w:top w:val="single" w:sz="4" w:space="0" w:color="auto"/>
-              <w:left w:val="single" w:sz="4" w:space="0" w:color="auto"/>
-              <w:bottom w:val="single" w:sz="4" w:space="0" w:color="auto"/>
-              <w:right w:val="single" w:sz="4" w:space="0" w:color="auto"/>
-            </w:tcBorders>
-            <w:tcMar>
-              <w:left w:w="576" w:type="dxa"/>
-              <w:right w:w="576" w:type="dxa"/>
-            </w:tcMar>
-            <w:vAlign w:val="center"/>
-          </w:tcPr>
-          <w:p>
-            <w:pPr>
-              <w:jc w:val="center"/>
-            </w:pPr>
-            <w:r>
-              <w:t>Median</w:t>
-            </w:r>
-          </w:p>
-        </w:tc>
-        <w:tc>
-          <w:tcPr>
-            <w:tcW w:w="2430" w:type="dxa"/>
-            <w:tcBorders>
-              <w:top w:val="single" w:sz="4" w:space="0" w:color="auto"/>
-              <w:left w:val="single" w:sz="4" w:space="0" w:color="auto"/>
-              <w:bottom w:val="single" w:sz="4" w:space="0" w:color="auto"/>
-              <w:right w:val="single" w:sz="4" w:space="0" w:color="auto"/>
-            </w:tcBorders>
-            <w:tcMar>
-              <w:left w:w="576" w:type="dxa"/>
-              <w:right w:w="576" w:type="dxa"/>
-            </w:tcMar>
-            <w:vAlign w:val="center"/>
-          </w:tcPr>
-          <w:p>
-            <w:pPr>
-              <w:jc w:val="center"/>
-              <w:rPr>
-                <w:highlight w:val="white"/>
-              </w:rPr>
-            </w:pPr>
-            <w:r>
-              <w:rPr>
-                <w:highlight w:val="white"/>
-              </w:rPr>
-              <w:t>0.696</w:t>
-            </w:r>
-          </w:p>
-        </w:tc>
-        <w:tc>
-          <w:tcPr>
-            <w:tcW w:w="2790" w:type="dxa"/>
-            <w:tcBorders>
-              <w:top w:val="single" w:sz="4" w:space="0" w:color="auto"/>
-              <w:left w:val="single" w:sz="4" w:space="0" w:color="auto"/>
-              <w:bottom w:val="single" w:sz="4" w:space="0" w:color="auto"/>
-              <w:right w:val="single" w:sz="4" w:space="0" w:color="auto"/>
-            </w:tcBorders>
-            <w:tcMar>
-              <w:left w:w="576" w:type="dxa"/>
-              <w:right w:w="576" w:type="dxa"/>
-            </w:tcMar>
-            <w:vAlign w:val="center"/>
-          </w:tcPr>
-          <w:p>
-            <w:pPr>
-              <w:jc w:val="center"/>
-              <w:rPr>
-                <w:highlight w:val="white"/>
-              </w:rPr>
-            </w:pPr>
-            <w:r>
-              <w:rPr>
-                <w:highlight w:val="white"/>
-              </w:rPr>
-              <w:t>0.841</w:t>
-            </w:r>
-          </w:p>
-        </w:tc>
-        <w:tc>
-          <w:tcPr>
-            <w:tcW w:w="2700" w:type="dxa"/>
-            <w:tcBorders>
-              <w:top w:val="single" w:sz="4" w:space="0" w:color="auto"/>
-              <w:left w:val="single" w:sz="4" w:space="0" w:color="auto"/>
-              <w:bottom w:val="single" w:sz="4" w:space="0" w:color="auto"/>
-              <w:right w:val="single" w:sz="4" w:space="0" w:color="auto"/>
-            </w:tcBorders>
-            <w:tcMar>
-              <w:left w:w="576" w:type="dxa"/>
-              <w:right w:w="576" w:type="dxa"/>
-            </w:tcMar>
-            <w:vAlign w:val="center"/>
-          </w:tcPr>
-          <w:p>
-            <w:pPr>
-              <w:jc w:val="center"/>
-              <w:rPr>
-                <w:highlight w:val="white"/>
-              </w:rPr>
-            </w:pPr>
-            <w:r>
-              <w:rPr>
-                <w:highlight w:val="white"/>
-              </w:rPr>
-              <w:t>0.687</w:t>
-            </w:r>
-          </w:p>
-        </w:tc>
-        <w:tc>
-          <w:tcPr>
-            <w:tcW w:w="2970" w:type="dxa"/>
-            <w:tcBorders>
-              <w:top w:val="single" w:sz="4" w:space="0" w:color="auto"/>
-              <w:left w:val="single" w:sz="4" w:space="0" w:color="auto"/>
-              <w:bottom w:val="single" w:sz="4" w:space="0" w:color="auto"/>
-              <w:right w:val="single" w:sz="4" w:space="0" w:color="auto"/>
-            </w:tcBorders>
-            <w:tcMar>
-              <w:left w:w="576" w:type="dxa"/>
-              <w:right w:w="576" w:type="dxa"/>
-            </w:tcMar>
-            <w:vAlign w:val="center"/>
-          </w:tcPr>
-          <w:p>
-            <w:pPr>
-              <w:jc w:val="center"/>
-              <w:rPr>
-                <w:highlight w:val="white"/>
-              </w:rPr>
-            </w:pPr>
-            <w:r>
-              <w:rPr>
-                <w:highlight w:val="white"/>
-              </w:rPr>
-              <w:t>0.825</w:t>
-            </w:r>
-          </w:p>
-        </w:tc>
-      </w:tr>
-      <w:tr>
-        <w:trPr>
-          <w:trHeight w:val="464"/>
-        </w:trPr>
-        <w:tc>
-          <w:tcPr>
-            <w:tcW w:w="1980" w:type="dxa"/>
-            <w:tcBorders>
-              <w:top w:val="single" w:sz="4" w:space="0" w:color="auto"/>
-              <w:left w:val="single" w:sz="4" w:space="0" w:color="auto"/>
-              <w:bottom w:val="single" w:sz="4" w:space="0" w:color="auto"/>
-              <w:right w:val="single" w:sz="4" w:space="0" w:color="auto"/>
-            </w:tcBorders>
-            <w:tcMar>
-              <w:left w:w="576" w:type="dxa"/>
-              <w:right w:w="576" w:type="dxa"/>
-            </w:tcMar>
-            <w:vAlign w:val="center"/>
-          </w:tcPr>
-          <w:p>
-            <w:pPr>
-              <w:jc w:val="center"/>
-              <w:rPr>
-                <w:highlight w:val="white"/>
-              </w:rPr>
-            </w:pPr>
-            <w:r>
-              <w:t>Mean</w:t>
-            </w:r>
-          </w:p>
-        </w:tc>
-        <w:tc>
-          <w:tcPr>
-            <w:tcW w:w="2430" w:type="dxa"/>
-            <w:tcBorders>
-              <w:top w:val="single" w:sz="4" w:space="0" w:color="auto"/>
-              <w:left w:val="single" w:sz="4" w:space="0" w:color="auto"/>
-              <w:bottom w:val="single" w:sz="4" w:space="0" w:color="auto"/>
-              <w:right w:val="single" w:sz="4" w:space="0" w:color="auto"/>
-            </w:tcBorders>
-            <w:tcMar>
-              <w:left w:w="576" w:type="dxa"/>
-              <w:right w:w="576" w:type="dxa"/>
-            </w:tcMar>
-            <w:vAlign w:val="center"/>
-          </w:tcPr>
-          <w:p>
-            <w:pPr>
-              <w:jc w:val="center"/>
-              <w:rPr>
-                <w:highlight w:val="white"/>
-              </w:rPr>
-            </w:pPr>
-            <w:r>
-              <w:rPr>
-                <w:highlight w:val="white"/>
-              </w:rPr>
-              <w:t>0.666</w:t>
-            </w:r>
-          </w:p>
-        </w:tc>
-        <w:tc>
-          <w:tcPr>
-            <w:tcW w:w="2790" w:type="dxa"/>
-            <w:tcBorders>
-              <w:top w:val="single" w:sz="4" w:space="0" w:color="auto"/>
-              <w:left w:val="single" w:sz="4" w:space="0" w:color="auto"/>
-              <w:bottom w:val="single" w:sz="4" w:space="0" w:color="auto"/>
-              <w:right w:val="single" w:sz="4" w:space="0" w:color="auto"/>
-            </w:tcBorders>
-            <w:tcMar>
-              <w:left w:w="576" w:type="dxa"/>
-              <w:right w:w="576" w:type="dxa"/>
-            </w:tcMar>
-            <w:vAlign w:val="center"/>
-          </w:tcPr>
-          <w:p>
-            <w:pPr>
-              <w:jc w:val="center"/>
-              <w:rPr>
-                <w:highlight w:val="white"/>
-              </w:rPr>
-            </w:pPr>
-            <w:r>
-              <w:rPr>
-                <w:highlight w:val="white"/>
-              </w:rPr>
-              <w:t>0.826</w:t>
-            </w:r>
-          </w:p>
-        </w:tc>
-        <w:tc>
-          <w:tcPr>
-            <w:tcW w:w="2700" w:type="dxa"/>
-            <w:tcBorders>
-              <w:top w:val="single" w:sz="4" w:space="0" w:color="auto"/>
-              <w:left w:val="single" w:sz="4" w:space="0" w:color="auto"/>
-              <w:bottom w:val="single" w:sz="4" w:space="0" w:color="auto"/>
-              <w:right w:val="single" w:sz="4" w:space="0" w:color="auto"/>
-            </w:tcBorders>
-            <w:tcMar>
-              <w:left w:w="576" w:type="dxa"/>
-              <w:right w:w="576" w:type="dxa"/>
-            </w:tcMar>
-            <w:vAlign w:val="center"/>
-          </w:tcPr>
-          <w:p>
-            <w:pPr>
-              <w:jc w:val="center"/>
-              <w:rPr>
-                <w:highlight w:val="white"/>
-              </w:rPr>
-            </w:pPr>
-            <w:r>
-              <w:rPr>
-                <w:highlight w:val="white"/>
-              </w:rPr>
-              <w:t>0.647</w:t>
-            </w:r>
-          </w:p>
-        </w:tc>
-        <w:tc>
-          <w:tcPr>
-            <w:tcW w:w="2970" w:type="dxa"/>
-            <w:tcBorders>
-              <w:top w:val="single" w:sz="4" w:space="0" w:color="auto"/>
-              <w:left w:val="single" w:sz="4" w:space="0" w:color="auto"/>
-              <w:bottom w:val="single" w:sz="4" w:space="0" w:color="auto"/>
-              <w:right w:val="single" w:sz="4" w:space="0" w:color="auto"/>
-            </w:tcBorders>
-            <w:tcMar>
-              <w:left w:w="576" w:type="dxa"/>
-              <w:right w:w="576" w:type="dxa"/>
-            </w:tcMar>
-            <w:vAlign w:val="center"/>
-          </w:tcPr>
-          <w:p>
-            <w:pPr>
-              <w:jc w:val="center"/>
-              <w:rPr>
-                <w:highlight w:val="white"/>
-              </w:rPr>
-            </w:pPr>
-            <w:r>
-              <w:rPr>
-                <w:highlight w:val="white"/>
-              </w:rPr>
-              <w:t>0.811</w:t>
-            </w:r>
-          </w:p>
-        </w:tc>
-      </w:tr>
-      <w:tr>
-        <w:trPr>
-          <w:trHeight w:val="431"/>
-        </w:trPr>
-        <w:tc>
-          <w:tcPr>
-            <w:tcW w:w="1980" w:type="dxa"/>
-            <w:tcBorders>
-              <w:top w:val="single" w:sz="4" w:space="0" w:color="auto"/>
-              <w:left w:val="single" w:sz="4" w:space="0" w:color="auto"/>
-              <w:bottom w:val="single" w:sz="4" w:space="0" w:color="auto"/>
-              <w:right w:val="single" w:sz="4" w:space="0" w:color="auto"/>
-            </w:tcBorders>
-            <w:tcMar>
-              <w:left w:w="576" w:type="dxa"/>
-              <w:right w:w="576" w:type="dxa"/>
-            </w:tcMar>
-            <w:vAlign w:val="center"/>
-          </w:tcPr>
-          <w:p>
-            <w:pPr>
-              <w:jc w:val="center"/>
-            </w:pPr>
-            <w:r>
-              <w:t>3</w:t>
-            </w:r>
-            <w:r>
-              <w:rPr>
-                <w:vertAlign w:val="superscript"/>
-              </w:rPr>
-              <w:t>rd</w:t>
-            </w:r>
-            <w:r>
-              <w:t xml:space="preserve"> Quartile</w:t>
-            </w:r>
-          </w:p>
-        </w:tc>
-        <w:tc>
-          <w:tcPr>
-            <w:tcW w:w="2430" w:type="dxa"/>
-            <w:tcBorders>
-              <w:top w:val="single" w:sz="4" w:space="0" w:color="auto"/>
-              <w:left w:val="single" w:sz="4" w:space="0" w:color="auto"/>
-              <w:bottom w:val="single" w:sz="4" w:space="0" w:color="auto"/>
-              <w:right w:val="single" w:sz="4" w:space="0" w:color="auto"/>
-            </w:tcBorders>
-            <w:tcMar>
-              <w:left w:w="576" w:type="dxa"/>
-              <w:right w:w="576" w:type="dxa"/>
-            </w:tcMar>
-            <w:vAlign w:val="center"/>
-          </w:tcPr>
-          <w:p>
-            <w:pPr>
-              <w:jc w:val="center"/>
-              <w:rPr>
-                <w:highlight w:val="white"/>
-              </w:rPr>
-            </w:pPr>
-            <w:r>
-              <w:rPr>
-                <w:highlight w:val="white"/>
-              </w:rPr>
-              <w:t>0.804</w:t>
-            </w:r>
-          </w:p>
-        </w:tc>
-        <w:tc>
-          <w:tcPr>
-            <w:tcW w:w="2790" w:type="dxa"/>
-            <w:tcBorders>
-              <w:top w:val="single" w:sz="4" w:space="0" w:color="auto"/>
-              <w:left w:val="single" w:sz="4" w:space="0" w:color="auto"/>
-              <w:bottom w:val="single" w:sz="4" w:space="0" w:color="auto"/>
-              <w:right w:val="single" w:sz="4" w:space="0" w:color="auto"/>
-            </w:tcBorders>
-            <w:tcMar>
-              <w:left w:w="576" w:type="dxa"/>
-              <w:right w:w="576" w:type="dxa"/>
-            </w:tcMar>
-            <w:vAlign w:val="center"/>
-          </w:tcPr>
-          <w:p>
-            <w:pPr>
-              <w:jc w:val="center"/>
-              <w:rPr>
-                <w:highlight w:val="white"/>
-              </w:rPr>
-            </w:pPr>
-            <w:r>
-              <w:rPr>
-                <w:highlight w:val="white"/>
-              </w:rPr>
-              <w:t>0.908</w:t>
-            </w:r>
-          </w:p>
-        </w:tc>
-        <w:tc>
-          <w:tcPr>
-            <w:tcW w:w="2700" w:type="dxa"/>
-            <w:tcBorders>
-              <w:top w:val="single" w:sz="4" w:space="0" w:color="auto"/>
-              <w:left w:val="single" w:sz="4" w:space="0" w:color="auto"/>
-              <w:bottom w:val="single" w:sz="4" w:space="0" w:color="auto"/>
-              <w:right w:val="single" w:sz="4" w:space="0" w:color="auto"/>
-            </w:tcBorders>
-            <w:tcMar>
-              <w:left w:w="576" w:type="dxa"/>
-              <w:right w:w="576" w:type="dxa"/>
-            </w:tcMar>
-            <w:vAlign w:val="center"/>
-          </w:tcPr>
-          <w:p>
-            <w:pPr>
-              <w:jc w:val="center"/>
-              <w:rPr>
-                <w:highlight w:val="white"/>
-              </w:rPr>
-            </w:pPr>
-            <w:r>
-              <w:rPr>
-                <w:highlight w:val="white"/>
-              </w:rPr>
-              <w:t>0.802</w:t>
-            </w:r>
-          </w:p>
-        </w:tc>
-        <w:tc>
-          <w:tcPr>
-            <w:tcW w:w="2970" w:type="dxa"/>
-            <w:tcBorders>
-              <w:top w:val="single" w:sz="4" w:space="0" w:color="auto"/>
-              <w:left w:val="single" w:sz="4" w:space="0" w:color="auto"/>
-              <w:bottom w:val="single" w:sz="4" w:space="0" w:color="auto"/>
-              <w:right w:val="single" w:sz="4" w:space="0" w:color="auto"/>
-            </w:tcBorders>
-            <w:tcMar>
-              <w:left w:w="576" w:type="dxa"/>
-              <w:right w:w="576" w:type="dxa"/>
-            </w:tcMar>
-            <w:vAlign w:val="center"/>
-          </w:tcPr>
-          <w:p>
-            <w:pPr>
-              <w:jc w:val="center"/>
-              <w:rPr>
-                <w:highlight w:val="white"/>
-              </w:rPr>
-            </w:pPr>
-            <w:r>
-              <w:rPr>
-                <w:highlight w:val="white"/>
-              </w:rPr>
-              <w:t>0.897</w:t>
-            </w:r>
-          </w:p>
-        </w:tc>
-      </w:tr>
-      <w:tr>
-        <w:trPr>
-          <w:trHeight w:val="431"/>
-        </w:trPr>
-        <w:tc>
-          <w:tcPr>
-            <w:tcW w:w="1980" w:type="dxa"/>
-            <w:tcBorders>
-              <w:top w:val="single" w:sz="4" w:space="0" w:color="auto"/>
-              <w:left w:val="single" w:sz="4" w:space="0" w:color="auto"/>
-              <w:bottom w:val="single" w:sz="4" w:space="0" w:color="auto"/>
-              <w:right w:val="single" w:sz="4" w:space="0" w:color="auto"/>
-            </w:tcBorders>
-            <w:tcMar>
-              <w:left w:w="576" w:type="dxa"/>
-              <w:right w:w="576" w:type="dxa"/>
-            </w:tcMar>
-            <w:vAlign w:val="center"/>
-          </w:tcPr>
-          <w:p>
-            <w:pPr>
-              <w:jc w:val="center"/>
-            </w:pPr>
-            <w:r>
-              <w:t>Maximum</w:t>
-            </w:r>
-          </w:p>
-        </w:tc>
-        <w:tc>
-          <w:tcPr>
-            <w:tcW w:w="2430" w:type="dxa"/>
-            <w:tcBorders>
-              <w:top w:val="single" w:sz="4" w:space="0" w:color="auto"/>
-              <w:left w:val="single" w:sz="4" w:space="0" w:color="auto"/>
-              <w:bottom w:val="single" w:sz="4" w:space="0" w:color="auto"/>
-              <w:right w:val="single" w:sz="4" w:space="0" w:color="auto"/>
-            </w:tcBorders>
-            <w:tcMar>
-              <w:left w:w="576" w:type="dxa"/>
-              <w:right w:w="576" w:type="dxa"/>
-            </w:tcMar>
-            <w:vAlign w:val="center"/>
-          </w:tcPr>
-          <w:p>
-            <w:pPr>
-              <w:jc w:val="center"/>
-              <w:rPr>
-                <w:highlight w:val="white"/>
-              </w:rPr>
-            </w:pPr>
-            <w:r>
-              <w:rPr>
-                <w:highlight w:val="white"/>
-              </w:rPr>
-              <w:t>1.010</w:t>
-            </w:r>
-          </w:p>
-        </w:tc>
-        <w:tc>
-          <w:tcPr>
-            <w:tcW w:w="2790" w:type="dxa"/>
-            <w:tcBorders>
-              <w:top w:val="single" w:sz="4" w:space="0" w:color="auto"/>
-              <w:left w:val="single" w:sz="4" w:space="0" w:color="auto"/>
-              <w:bottom w:val="single" w:sz="4" w:space="0" w:color="auto"/>
-              <w:right w:val="single" w:sz="4" w:space="0" w:color="auto"/>
-            </w:tcBorders>
-            <w:tcMar>
-              <w:left w:w="576" w:type="dxa"/>
-              <w:right w:w="576" w:type="dxa"/>
-            </w:tcMar>
-            <w:vAlign w:val="center"/>
-          </w:tcPr>
-          <w:p>
-            <w:pPr>
-              <w:jc w:val="center"/>
-              <w:rPr>
-                <w:highlight w:val="white"/>
-              </w:rPr>
-            </w:pPr>
-            <w:r>
-              <w:rPr>
-                <w:highlight w:val="white"/>
-              </w:rPr>
-              <w:t>1.090</w:t>
-            </w:r>
-          </w:p>
-        </w:tc>
-        <w:tc>
-          <w:tcPr>
-            <w:tcW w:w="2700" w:type="dxa"/>
-            <w:tcBorders>
-              <w:top w:val="single" w:sz="4" w:space="0" w:color="auto"/>
-              <w:left w:val="single" w:sz="4" w:space="0" w:color="auto"/>
-              <w:bottom w:val="single" w:sz="4" w:space="0" w:color="auto"/>
-              <w:right w:val="single" w:sz="4" w:space="0" w:color="auto"/>
-            </w:tcBorders>
-            <w:tcMar>
-              <w:left w:w="576" w:type="dxa"/>
-              <w:right w:w="576" w:type="dxa"/>
-            </w:tcMar>
-            <w:vAlign w:val="center"/>
-          </w:tcPr>
-          <w:p>
-            <w:pPr>
-              <w:jc w:val="center"/>
-              <w:rPr>
-                <w:highlight w:val="white"/>
-              </w:rPr>
-            </w:pPr>
-            <w:r>
-              <w:rPr>
-                <w:highlight w:val="white"/>
-              </w:rPr>
-              <w:t>1.080</w:t>
-            </w:r>
-          </w:p>
-        </w:tc>
-        <w:tc>
-          <w:tcPr>
-            <w:tcW w:w="2970" w:type="dxa"/>
-            <w:tcBorders>
-              <w:top w:val="single" w:sz="4" w:space="0" w:color="auto"/>
-              <w:left w:val="single" w:sz="4" w:space="0" w:color="auto"/>
+              <w:top w:val="nil"/>
               <w:bottom w:val="single" w:sz="4" w:space="0" w:color="auto"/>
               <w:right w:val="single" w:sz="4" w:space="0" w:color="auto"/>
             </w:tcBorders>
@@ -26532,6 +26544,891 @@
             <w:tcBorders>
               <w:top w:val="single" w:sz="4" w:space="0" w:color="auto"/>
               <w:left w:val="single" w:sz="4" w:space="0" w:color="auto"/>
+              <w:bottom w:val="nil"/>
+              <w:right w:val="single" w:sz="4" w:space="0" w:color="auto"/>
+            </w:tcBorders>
+            <w:shd w:val="clear" w:color="auto" w:fill="auto"/>
+            <w:tcMar>
+              <w:top w:w="100" w:type="dxa"/>
+              <w:left w:w="576" w:type="dxa"/>
+              <w:bottom w:w="100" w:type="dxa"/>
+              <w:right w:w="576" w:type="dxa"/>
+            </w:tcMar>
+            <w:vAlign w:val="center"/>
+          </w:tcPr>
+          <w:p>
+            <w:pPr>
+              <w:jc w:val="center"/>
+              <w:rPr>
+                <w:highlight w:val="white"/>
+              </w:rPr>
+            </w:pPr>
+            <w:r>
+              <w:t>Minimum</w:t>
+            </w:r>
+          </w:p>
+        </w:tc>
+        <w:tc>
+          <w:tcPr>
+            <w:tcW w:w="2714" w:type="dxa"/>
+            <w:tcBorders>
+              <w:top w:val="single" w:sz="4" w:space="0" w:color="auto"/>
+              <w:left w:val="single" w:sz="4" w:space="0" w:color="auto"/>
+              <w:bottom w:val="nil"/>
+              <w:right w:val="nil"/>
+            </w:tcBorders>
+            <w:shd w:val="clear" w:color="auto" w:fill="auto"/>
+            <w:tcMar>
+              <w:top w:w="100" w:type="dxa"/>
+              <w:left w:w="576" w:type="dxa"/>
+              <w:bottom w:w="100" w:type="dxa"/>
+              <w:right w:w="576" w:type="dxa"/>
+            </w:tcMar>
+            <w:vAlign w:val="center"/>
+          </w:tcPr>
+          <w:p>
+            <w:pPr>
+              <w:jc w:val="center"/>
+              <w:rPr>
+                <w:highlight w:val="white"/>
+              </w:rPr>
+            </w:pPr>
+            <w:r>
+              <w:rPr>
+                <w:highlight w:val="white"/>
+              </w:rPr>
+              <w:t>0.000</w:t>
+            </w:r>
+          </w:p>
+        </w:tc>
+        <w:tc>
+          <w:tcPr>
+            <w:tcW w:w="2714" w:type="dxa"/>
+            <w:tcBorders>
+              <w:top w:val="single" w:sz="4" w:space="0" w:color="auto"/>
+              <w:left w:val="nil"/>
+              <w:bottom w:val="nil"/>
+              <w:right w:val="single" w:sz="4" w:space="0" w:color="auto"/>
+            </w:tcBorders>
+            <w:shd w:val="clear" w:color="auto" w:fill="auto"/>
+            <w:tcMar>
+              <w:top w:w="100" w:type="dxa"/>
+              <w:left w:w="576" w:type="dxa"/>
+              <w:bottom w:w="100" w:type="dxa"/>
+              <w:right w:w="576" w:type="dxa"/>
+            </w:tcMar>
+            <w:vAlign w:val="center"/>
+          </w:tcPr>
+          <w:p>
+            <w:pPr>
+              <w:jc w:val="center"/>
+              <w:rPr>
+                <w:highlight w:val="white"/>
+              </w:rPr>
+            </w:pPr>
+            <w:r>
+              <w:rPr>
+                <w:highlight w:val="white"/>
+              </w:rPr>
+              <w:t>0.163</w:t>
+            </w:r>
+          </w:p>
+        </w:tc>
+        <w:tc>
+          <w:tcPr>
+            <w:tcW w:w="2715" w:type="dxa"/>
+            <w:tcBorders>
+              <w:top w:val="single" w:sz="4" w:space="0" w:color="auto"/>
+              <w:left w:val="single" w:sz="4" w:space="0" w:color="auto"/>
+              <w:bottom w:val="nil"/>
+              <w:right w:val="nil"/>
+            </w:tcBorders>
+            <w:shd w:val="clear" w:color="auto" w:fill="auto"/>
+            <w:tcMar>
+              <w:top w:w="100" w:type="dxa"/>
+              <w:left w:w="576" w:type="dxa"/>
+              <w:bottom w:w="100" w:type="dxa"/>
+              <w:right w:w="576" w:type="dxa"/>
+            </w:tcMar>
+            <w:vAlign w:val="center"/>
+          </w:tcPr>
+          <w:p>
+            <w:pPr>
+              <w:jc w:val="center"/>
+              <w:rPr>
+                <w:highlight w:val="white"/>
+              </w:rPr>
+            </w:pPr>
+            <w:r>
+              <w:rPr>
+                <w:highlight w:val="white"/>
+              </w:rPr>
+              <w:t>0.000</w:t>
+            </w:r>
+          </w:p>
+        </w:tc>
+        <w:tc>
+          <w:tcPr>
+            <w:tcW w:w="2715" w:type="dxa"/>
+            <w:tcBorders>
+              <w:top w:val="single" w:sz="4" w:space="0" w:color="auto"/>
+              <w:left w:val="nil"/>
+              <w:bottom w:val="nil"/>
+              <w:right w:val="single" w:sz="4" w:space="0" w:color="auto"/>
+            </w:tcBorders>
+            <w:shd w:val="clear" w:color="auto" w:fill="auto"/>
+            <w:tcMar>
+              <w:top w:w="100" w:type="dxa"/>
+              <w:left w:w="576" w:type="dxa"/>
+              <w:bottom w:w="100" w:type="dxa"/>
+              <w:right w:w="576" w:type="dxa"/>
+            </w:tcMar>
+            <w:vAlign w:val="center"/>
+          </w:tcPr>
+          <w:p>
+            <w:pPr>
+              <w:jc w:val="center"/>
+              <w:rPr>
+                <w:highlight w:val="white"/>
+              </w:rPr>
+            </w:pPr>
+            <w:r>
+              <w:rPr>
+                <w:highlight w:val="white"/>
+              </w:rPr>
+              <w:t>0.163</w:t>
+            </w:r>
+          </w:p>
+        </w:tc>
+      </w:tr>
+      <w:tr>
+        <w:tc>
+          <w:tcPr>
+            <w:tcW w:w="2730" w:type="dxa"/>
+            <w:tcBorders>
+              <w:top w:val="nil"/>
+              <w:left w:val="single" w:sz="4" w:space="0" w:color="auto"/>
+              <w:bottom w:val="nil"/>
+              <w:right w:val="single" w:sz="4" w:space="0" w:color="auto"/>
+            </w:tcBorders>
+            <w:tcMar>
+              <w:top w:w="0" w:type="dxa"/>
+              <w:left w:w="576" w:type="dxa"/>
+              <w:bottom w:w="0" w:type="dxa"/>
+              <w:right w:w="576" w:type="dxa"/>
+            </w:tcMar>
+            <w:vAlign w:val="center"/>
+          </w:tcPr>
+          <w:p>
+            <w:pPr>
+              <w:jc w:val="center"/>
+            </w:pPr>
+            <w:r>
+              <w:t>1</w:t>
+            </w:r>
+            <w:r>
+              <w:rPr>
+                <w:vertAlign w:val="superscript"/>
+              </w:rPr>
+              <w:t>st</w:t>
+            </w:r>
+            <w:r>
+              <w:t xml:space="preserve"> Quartile</w:t>
+            </w:r>
+          </w:p>
+        </w:tc>
+        <w:tc>
+          <w:tcPr>
+            <w:tcW w:w="2714" w:type="dxa"/>
+            <w:tcBorders>
+              <w:top w:val="nil"/>
+              <w:left w:val="single" w:sz="4" w:space="0" w:color="auto"/>
+              <w:bottom w:val="nil"/>
+              <w:right w:val="nil"/>
+            </w:tcBorders>
+            <w:shd w:val="clear" w:color="auto" w:fill="auto"/>
+            <w:tcMar>
+              <w:top w:w="100" w:type="dxa"/>
+              <w:left w:w="576" w:type="dxa"/>
+              <w:bottom w:w="100" w:type="dxa"/>
+              <w:right w:w="576" w:type="dxa"/>
+            </w:tcMar>
+            <w:vAlign w:val="center"/>
+          </w:tcPr>
+          <w:p>
+            <w:pPr>
+              <w:jc w:val="center"/>
+              <w:rPr>
+                <w:highlight w:val="white"/>
+              </w:rPr>
+            </w:pPr>
+            <w:r>
+              <w:rPr>
+                <w:highlight w:val="white"/>
+              </w:rPr>
+              <w:t>0.442</w:t>
+            </w:r>
+          </w:p>
+        </w:tc>
+        <w:tc>
+          <w:tcPr>
+            <w:tcW w:w="2714" w:type="dxa"/>
+            <w:tcBorders>
+              <w:top w:val="nil"/>
+              <w:left w:val="nil"/>
+              <w:bottom w:val="nil"/>
+              <w:right w:val="single" w:sz="4" w:space="0" w:color="auto"/>
+            </w:tcBorders>
+            <w:shd w:val="clear" w:color="auto" w:fill="auto"/>
+            <w:tcMar>
+              <w:top w:w="100" w:type="dxa"/>
+              <w:left w:w="576" w:type="dxa"/>
+              <w:bottom w:w="100" w:type="dxa"/>
+              <w:right w:w="576" w:type="dxa"/>
+            </w:tcMar>
+            <w:vAlign w:val="center"/>
+          </w:tcPr>
+          <w:p>
+            <w:pPr>
+              <w:jc w:val="center"/>
+              <w:rPr>
+                <w:highlight w:val="white"/>
+              </w:rPr>
+            </w:pPr>
+            <w:r>
+              <w:rPr>
+                <w:highlight w:val="white"/>
+              </w:rPr>
+              <w:t>0.628</w:t>
+            </w:r>
+          </w:p>
+        </w:tc>
+        <w:tc>
+          <w:tcPr>
+            <w:tcW w:w="2715" w:type="dxa"/>
+            <w:tcBorders>
+              <w:top w:val="nil"/>
+              <w:left w:val="single" w:sz="4" w:space="0" w:color="auto"/>
+              <w:bottom w:val="nil"/>
+              <w:right w:val="nil"/>
+            </w:tcBorders>
+            <w:shd w:val="clear" w:color="auto" w:fill="auto"/>
+            <w:tcMar>
+              <w:top w:w="100" w:type="dxa"/>
+              <w:left w:w="576" w:type="dxa"/>
+              <w:bottom w:w="100" w:type="dxa"/>
+              <w:right w:w="576" w:type="dxa"/>
+            </w:tcMar>
+            <w:vAlign w:val="center"/>
+          </w:tcPr>
+          <w:p>
+            <w:pPr>
+              <w:jc w:val="center"/>
+              <w:rPr>
+                <w:highlight w:val="white"/>
+              </w:rPr>
+            </w:pPr>
+            <w:r>
+              <w:rPr>
+                <w:highlight w:val="white"/>
+              </w:rPr>
+              <w:t>0.418</w:t>
+            </w:r>
+          </w:p>
+        </w:tc>
+        <w:tc>
+          <w:tcPr>
+            <w:tcW w:w="2715" w:type="dxa"/>
+            <w:tcBorders>
+              <w:top w:val="nil"/>
+              <w:left w:val="nil"/>
+              <w:bottom w:val="nil"/>
+              <w:right w:val="single" w:sz="4" w:space="0" w:color="auto"/>
+            </w:tcBorders>
+            <w:shd w:val="clear" w:color="auto" w:fill="auto"/>
+            <w:tcMar>
+              <w:top w:w="100" w:type="dxa"/>
+              <w:left w:w="576" w:type="dxa"/>
+              <w:bottom w:w="100" w:type="dxa"/>
+              <w:right w:w="576" w:type="dxa"/>
+            </w:tcMar>
+            <w:vAlign w:val="center"/>
+          </w:tcPr>
+          <w:p>
+            <w:pPr>
+              <w:jc w:val="center"/>
+              <w:rPr>
+                <w:highlight w:val="white"/>
+              </w:rPr>
+            </w:pPr>
+            <w:r>
+              <w:rPr>
+                <w:highlight w:val="white"/>
+              </w:rPr>
+              <w:t>0.603</w:t>
+            </w:r>
+          </w:p>
+        </w:tc>
+      </w:tr>
+      <w:tr>
+        <w:tc>
+          <w:tcPr>
+            <w:tcW w:w="2730" w:type="dxa"/>
+            <w:tcBorders>
+              <w:top w:val="nil"/>
+              <w:left w:val="single" w:sz="4" w:space="0" w:color="auto"/>
+              <w:bottom w:val="nil"/>
+              <w:right w:val="single" w:sz="4" w:space="0" w:color="auto"/>
+            </w:tcBorders>
+            <w:tcMar>
+              <w:top w:w="0" w:type="dxa"/>
+              <w:left w:w="576" w:type="dxa"/>
+              <w:bottom w:w="0" w:type="dxa"/>
+              <w:right w:w="576" w:type="dxa"/>
+            </w:tcMar>
+            <w:vAlign w:val="center"/>
+          </w:tcPr>
+          <w:p>
+            <w:pPr>
+              <w:jc w:val="center"/>
+            </w:pPr>
+            <w:r>
+              <w:t>Median</w:t>
+            </w:r>
+          </w:p>
+        </w:tc>
+        <w:tc>
+          <w:tcPr>
+            <w:tcW w:w="2714" w:type="dxa"/>
+            <w:tcBorders>
+              <w:top w:val="nil"/>
+              <w:left w:val="single" w:sz="4" w:space="0" w:color="auto"/>
+              <w:bottom w:val="nil"/>
+              <w:right w:val="nil"/>
+            </w:tcBorders>
+            <w:shd w:val="clear" w:color="auto" w:fill="auto"/>
+            <w:tcMar>
+              <w:top w:w="100" w:type="dxa"/>
+              <w:left w:w="576" w:type="dxa"/>
+              <w:bottom w:w="100" w:type="dxa"/>
+              <w:right w:w="576" w:type="dxa"/>
+            </w:tcMar>
+            <w:vAlign w:val="center"/>
+          </w:tcPr>
+          <w:p>
+            <w:pPr>
+              <w:jc w:val="center"/>
+              <w:rPr>
+                <w:highlight w:val="white"/>
+              </w:rPr>
+            </w:pPr>
+            <w:r>
+              <w:rPr>
+                <w:highlight w:val="white"/>
+              </w:rPr>
+              <w:t>0.574</w:t>
+            </w:r>
+          </w:p>
+        </w:tc>
+        <w:tc>
+          <w:tcPr>
+            <w:tcW w:w="2714" w:type="dxa"/>
+            <w:tcBorders>
+              <w:top w:val="nil"/>
+              <w:left w:val="nil"/>
+              <w:bottom w:val="nil"/>
+              <w:right w:val="single" w:sz="4" w:space="0" w:color="auto"/>
+            </w:tcBorders>
+            <w:shd w:val="clear" w:color="auto" w:fill="auto"/>
+            <w:tcMar>
+              <w:top w:w="100" w:type="dxa"/>
+              <w:left w:w="576" w:type="dxa"/>
+              <w:bottom w:w="100" w:type="dxa"/>
+              <w:right w:w="576" w:type="dxa"/>
+            </w:tcMar>
+            <w:vAlign w:val="center"/>
+          </w:tcPr>
+          <w:p>
+            <w:pPr>
+              <w:jc w:val="center"/>
+              <w:rPr>
+                <w:highlight w:val="white"/>
+              </w:rPr>
+            </w:pPr>
+            <w:r>
+              <w:rPr>
+                <w:highlight w:val="white"/>
+              </w:rPr>
+              <w:t>0.736</w:t>
+            </w:r>
+          </w:p>
+        </w:tc>
+        <w:tc>
+          <w:tcPr>
+            <w:tcW w:w="2715" w:type="dxa"/>
+            <w:tcBorders>
+              <w:top w:val="nil"/>
+              <w:left w:val="single" w:sz="4" w:space="0" w:color="auto"/>
+              <w:bottom w:val="nil"/>
+              <w:right w:val="nil"/>
+            </w:tcBorders>
+            <w:shd w:val="clear" w:color="auto" w:fill="auto"/>
+            <w:tcMar>
+              <w:top w:w="100" w:type="dxa"/>
+              <w:left w:w="576" w:type="dxa"/>
+              <w:bottom w:w="100" w:type="dxa"/>
+              <w:right w:w="576" w:type="dxa"/>
+            </w:tcMar>
+            <w:vAlign w:val="center"/>
+          </w:tcPr>
+          <w:p>
+            <w:pPr>
+              <w:jc w:val="center"/>
+              <w:rPr>
+                <w:highlight w:val="white"/>
+              </w:rPr>
+            </w:pPr>
+            <w:r>
+              <w:rPr>
+                <w:highlight w:val="white"/>
+              </w:rPr>
+              <w:t>0.548</w:t>
+            </w:r>
+          </w:p>
+        </w:tc>
+        <w:tc>
+          <w:tcPr>
+            <w:tcW w:w="2715" w:type="dxa"/>
+            <w:tcBorders>
+              <w:top w:val="nil"/>
+              <w:left w:val="nil"/>
+              <w:bottom w:val="nil"/>
+              <w:right w:val="single" w:sz="4" w:space="0" w:color="auto"/>
+            </w:tcBorders>
+            <w:shd w:val="clear" w:color="auto" w:fill="auto"/>
+            <w:tcMar>
+              <w:top w:w="100" w:type="dxa"/>
+              <w:left w:w="576" w:type="dxa"/>
+              <w:bottom w:w="100" w:type="dxa"/>
+              <w:right w:w="576" w:type="dxa"/>
+            </w:tcMar>
+            <w:vAlign w:val="center"/>
+          </w:tcPr>
+          <w:p>
+            <w:pPr>
+              <w:jc w:val="center"/>
+              <w:rPr>
+                <w:highlight w:val="white"/>
+              </w:rPr>
+            </w:pPr>
+            <w:r>
+              <w:rPr>
+                <w:highlight w:val="white"/>
+              </w:rPr>
+              <w:t>0.719</w:t>
+            </w:r>
+          </w:p>
+        </w:tc>
+      </w:tr>
+      <w:tr>
+        <w:tc>
+          <w:tcPr>
+            <w:tcW w:w="2730" w:type="dxa"/>
+            <w:tcBorders>
+              <w:top w:val="nil"/>
+              <w:left w:val="single" w:sz="4" w:space="0" w:color="auto"/>
+              <w:bottom w:val="nil"/>
+              <w:right w:val="single" w:sz="4" w:space="0" w:color="auto"/>
+            </w:tcBorders>
+            <w:shd w:val="clear" w:color="auto" w:fill="auto"/>
+            <w:tcMar>
+              <w:top w:w="100" w:type="dxa"/>
+              <w:left w:w="576" w:type="dxa"/>
+              <w:bottom w:w="100" w:type="dxa"/>
+              <w:right w:w="576" w:type="dxa"/>
+            </w:tcMar>
+            <w:vAlign w:val="center"/>
+          </w:tcPr>
+          <w:p>
+            <w:pPr>
+              <w:jc w:val="center"/>
+              <w:rPr>
+                <w:highlight w:val="white"/>
+              </w:rPr>
+            </w:pPr>
+            <w:r>
+              <w:t>Mean</w:t>
+            </w:r>
+          </w:p>
+        </w:tc>
+        <w:tc>
+          <w:tcPr>
+            <w:tcW w:w="2714" w:type="dxa"/>
+            <w:tcBorders>
+              <w:top w:val="nil"/>
+              <w:left w:val="single" w:sz="4" w:space="0" w:color="auto"/>
+              <w:bottom w:val="nil"/>
+              <w:right w:val="nil"/>
+            </w:tcBorders>
+            <w:shd w:val="clear" w:color="auto" w:fill="auto"/>
+            <w:tcMar>
+              <w:top w:w="100" w:type="dxa"/>
+              <w:left w:w="576" w:type="dxa"/>
+              <w:bottom w:w="100" w:type="dxa"/>
+              <w:right w:w="576" w:type="dxa"/>
+            </w:tcMar>
+            <w:vAlign w:val="center"/>
+          </w:tcPr>
+          <w:p>
+            <w:pPr>
+              <w:jc w:val="center"/>
+              <w:rPr>
+                <w:highlight w:val="white"/>
+              </w:rPr>
+            </w:pPr>
+            <w:r>
+              <w:rPr>
+                <w:highlight w:val="white"/>
+              </w:rPr>
+              <w:t>0.553</w:t>
+            </w:r>
+          </w:p>
+        </w:tc>
+        <w:tc>
+          <w:tcPr>
+            <w:tcW w:w="2714" w:type="dxa"/>
+            <w:tcBorders>
+              <w:top w:val="nil"/>
+              <w:left w:val="nil"/>
+              <w:bottom w:val="nil"/>
+              <w:right w:val="single" w:sz="4" w:space="0" w:color="auto"/>
+            </w:tcBorders>
+            <w:shd w:val="clear" w:color="auto" w:fill="auto"/>
+            <w:tcMar>
+              <w:top w:w="100" w:type="dxa"/>
+              <w:left w:w="576" w:type="dxa"/>
+              <w:bottom w:w="100" w:type="dxa"/>
+              <w:right w:w="576" w:type="dxa"/>
+            </w:tcMar>
+            <w:vAlign w:val="center"/>
+          </w:tcPr>
+          <w:p>
+            <w:pPr>
+              <w:jc w:val="center"/>
+              <w:rPr>
+                <w:highlight w:val="white"/>
+              </w:rPr>
+            </w:pPr>
+            <w:r>
+              <w:rPr>
+                <w:highlight w:val="white"/>
+              </w:rPr>
+              <w:t>0.729</w:t>
+            </w:r>
+          </w:p>
+        </w:tc>
+        <w:tc>
+          <w:tcPr>
+            <w:tcW w:w="2715" w:type="dxa"/>
+            <w:tcBorders>
+              <w:top w:val="nil"/>
+              <w:left w:val="single" w:sz="4" w:space="0" w:color="auto"/>
+              <w:bottom w:val="nil"/>
+              <w:right w:val="nil"/>
+            </w:tcBorders>
+            <w:shd w:val="clear" w:color="auto" w:fill="auto"/>
+            <w:tcMar>
+              <w:top w:w="100" w:type="dxa"/>
+              <w:left w:w="576" w:type="dxa"/>
+              <w:bottom w:w="100" w:type="dxa"/>
+              <w:right w:w="576" w:type="dxa"/>
+            </w:tcMar>
+            <w:vAlign w:val="center"/>
+          </w:tcPr>
+          <w:p>
+            <w:pPr>
+              <w:jc w:val="center"/>
+              <w:rPr>
+                <w:highlight w:val="white"/>
+              </w:rPr>
+            </w:pPr>
+            <w:r>
+              <w:rPr>
+                <w:highlight w:val="white"/>
+              </w:rPr>
+              <w:t>0.521</w:t>
+            </w:r>
+          </w:p>
+        </w:tc>
+        <w:tc>
+          <w:tcPr>
+            <w:tcW w:w="2715" w:type="dxa"/>
+            <w:tcBorders>
+              <w:top w:val="nil"/>
+              <w:left w:val="nil"/>
+              <w:bottom w:val="nil"/>
+              <w:right w:val="single" w:sz="4" w:space="0" w:color="auto"/>
+            </w:tcBorders>
+            <w:shd w:val="clear" w:color="auto" w:fill="auto"/>
+            <w:tcMar>
+              <w:top w:w="100" w:type="dxa"/>
+              <w:left w:w="576" w:type="dxa"/>
+              <w:bottom w:w="100" w:type="dxa"/>
+              <w:right w:w="576" w:type="dxa"/>
+            </w:tcMar>
+            <w:vAlign w:val="center"/>
+          </w:tcPr>
+          <w:p>
+            <w:pPr>
+              <w:jc w:val="center"/>
+              <w:rPr>
+                <w:highlight w:val="white"/>
+              </w:rPr>
+            </w:pPr>
+            <w:r>
+              <w:rPr>
+                <w:highlight w:val="white"/>
+              </w:rPr>
+              <w:t>0.708</w:t>
+            </w:r>
+          </w:p>
+        </w:tc>
+      </w:tr>
+      <w:tr>
+        <w:tc>
+          <w:tcPr>
+            <w:tcW w:w="2730" w:type="dxa"/>
+            <w:tcBorders>
+              <w:top w:val="nil"/>
+              <w:left w:val="single" w:sz="4" w:space="0" w:color="auto"/>
+              <w:bottom w:val="nil"/>
+              <w:right w:val="single" w:sz="4" w:space="0" w:color="auto"/>
+            </w:tcBorders>
+            <w:tcMar>
+              <w:top w:w="0" w:type="dxa"/>
+              <w:left w:w="576" w:type="dxa"/>
+              <w:bottom w:w="0" w:type="dxa"/>
+              <w:right w:w="576" w:type="dxa"/>
+            </w:tcMar>
+            <w:vAlign w:val="center"/>
+          </w:tcPr>
+          <w:p>
+            <w:pPr>
+              <w:jc w:val="center"/>
+            </w:pPr>
+            <w:r>
+              <w:t>3</w:t>
+            </w:r>
+            <w:r>
+              <w:rPr>
+                <w:vertAlign w:val="superscript"/>
+              </w:rPr>
+              <w:t>rd</w:t>
+            </w:r>
+            <w:r>
+              <w:t xml:space="preserve"> Quartile</w:t>
+            </w:r>
+          </w:p>
+        </w:tc>
+        <w:tc>
+          <w:tcPr>
+            <w:tcW w:w="2714" w:type="dxa"/>
+            <w:tcBorders>
+              <w:top w:val="nil"/>
+              <w:left w:val="single" w:sz="4" w:space="0" w:color="auto"/>
+              <w:bottom w:val="nil"/>
+              <w:right w:val="nil"/>
+            </w:tcBorders>
+            <w:shd w:val="clear" w:color="auto" w:fill="auto"/>
+            <w:tcMar>
+              <w:top w:w="100" w:type="dxa"/>
+              <w:left w:w="576" w:type="dxa"/>
+              <w:bottom w:w="100" w:type="dxa"/>
+              <w:right w:w="576" w:type="dxa"/>
+            </w:tcMar>
+            <w:vAlign w:val="center"/>
+          </w:tcPr>
+          <w:p>
+            <w:pPr>
+              <w:jc w:val="center"/>
+              <w:rPr>
+                <w:highlight w:val="white"/>
+              </w:rPr>
+            </w:pPr>
+            <w:r>
+              <w:rPr>
+                <w:highlight w:val="white"/>
+              </w:rPr>
+              <w:t>0.700</w:t>
+            </w:r>
+          </w:p>
+        </w:tc>
+        <w:tc>
+          <w:tcPr>
+            <w:tcW w:w="2714" w:type="dxa"/>
+            <w:tcBorders>
+              <w:top w:val="nil"/>
+              <w:left w:val="nil"/>
+              <w:bottom w:val="nil"/>
+              <w:right w:val="single" w:sz="4" w:space="0" w:color="auto"/>
+            </w:tcBorders>
+            <w:shd w:val="clear" w:color="auto" w:fill="auto"/>
+            <w:tcMar>
+              <w:top w:w="100" w:type="dxa"/>
+              <w:left w:w="576" w:type="dxa"/>
+              <w:bottom w:w="100" w:type="dxa"/>
+              <w:right w:w="576" w:type="dxa"/>
+            </w:tcMar>
+            <w:vAlign w:val="center"/>
+          </w:tcPr>
+          <w:p>
+            <w:pPr>
+              <w:jc w:val="center"/>
+              <w:rPr>
+                <w:highlight w:val="white"/>
+              </w:rPr>
+            </w:pPr>
+            <w:r>
+              <w:rPr>
+                <w:highlight w:val="white"/>
+              </w:rPr>
+              <w:t>0.828</w:t>
+            </w:r>
+          </w:p>
+        </w:tc>
+        <w:tc>
+          <w:tcPr>
+            <w:tcW w:w="2715" w:type="dxa"/>
+            <w:tcBorders>
+              <w:top w:val="nil"/>
+              <w:left w:val="single" w:sz="4" w:space="0" w:color="auto"/>
+              <w:bottom w:val="nil"/>
+              <w:right w:val="nil"/>
+            </w:tcBorders>
+            <w:shd w:val="clear" w:color="auto" w:fill="auto"/>
+            <w:tcMar>
+              <w:top w:w="100" w:type="dxa"/>
+              <w:left w:w="576" w:type="dxa"/>
+              <w:bottom w:w="100" w:type="dxa"/>
+              <w:right w:w="576" w:type="dxa"/>
+            </w:tcMar>
+            <w:vAlign w:val="center"/>
+          </w:tcPr>
+          <w:p>
+            <w:pPr>
+              <w:jc w:val="center"/>
+              <w:rPr>
+                <w:highlight w:val="white"/>
+              </w:rPr>
+            </w:pPr>
+            <w:r>
+              <w:rPr>
+                <w:highlight w:val="white"/>
+              </w:rPr>
+              <w:t>0.669</w:t>
+            </w:r>
+          </w:p>
+        </w:tc>
+        <w:tc>
+          <w:tcPr>
+            <w:tcW w:w="2715" w:type="dxa"/>
+            <w:tcBorders>
+              <w:top w:val="nil"/>
+              <w:left w:val="nil"/>
+              <w:bottom w:val="nil"/>
+              <w:right w:val="single" w:sz="4" w:space="0" w:color="auto"/>
+            </w:tcBorders>
+            <w:shd w:val="clear" w:color="auto" w:fill="auto"/>
+            <w:tcMar>
+              <w:top w:w="100" w:type="dxa"/>
+              <w:left w:w="576" w:type="dxa"/>
+              <w:bottom w:w="100" w:type="dxa"/>
+              <w:right w:w="576" w:type="dxa"/>
+            </w:tcMar>
+            <w:vAlign w:val="center"/>
+          </w:tcPr>
+          <w:p>
+            <w:pPr>
+              <w:jc w:val="center"/>
+              <w:rPr>
+                <w:highlight w:val="white"/>
+              </w:rPr>
+            </w:pPr>
+            <w:r>
+              <w:rPr>
+                <w:highlight w:val="white"/>
+              </w:rPr>
+              <w:t>0.817</w:t>
+            </w:r>
+          </w:p>
+        </w:tc>
+      </w:tr>
+      <w:tr>
+        <w:tc>
+          <w:tcPr>
+            <w:tcW w:w="2730" w:type="dxa"/>
+            <w:tcBorders>
+              <w:top w:val="nil"/>
+              <w:left w:val="single" w:sz="4" w:space="0" w:color="auto"/>
+              <w:bottom w:val="single" w:sz="4" w:space="0" w:color="auto"/>
+              <w:right w:val="single" w:sz="4" w:space="0" w:color="auto"/>
+            </w:tcBorders>
+            <w:tcMar>
+              <w:top w:w="0" w:type="dxa"/>
+              <w:left w:w="576" w:type="dxa"/>
+              <w:bottom w:w="0" w:type="dxa"/>
+              <w:right w:w="576" w:type="dxa"/>
+            </w:tcMar>
+            <w:vAlign w:val="center"/>
+          </w:tcPr>
+          <w:p>
+            <w:pPr>
+              <w:jc w:val="center"/>
+            </w:pPr>
+            <w:r>
+              <w:t>Maximum</w:t>
+            </w:r>
+          </w:p>
+        </w:tc>
+        <w:tc>
+          <w:tcPr>
+            <w:tcW w:w="2714" w:type="dxa"/>
+            <w:tcBorders>
+              <w:top w:val="nil"/>
+              <w:left w:val="single" w:sz="4" w:space="0" w:color="auto"/>
+              <w:bottom w:val="single" w:sz="4" w:space="0" w:color="auto"/>
+              <w:right w:val="nil"/>
+            </w:tcBorders>
+            <w:shd w:val="clear" w:color="auto" w:fill="auto"/>
+            <w:tcMar>
+              <w:top w:w="100" w:type="dxa"/>
+              <w:left w:w="576" w:type="dxa"/>
+              <w:bottom w:w="100" w:type="dxa"/>
+              <w:right w:w="576" w:type="dxa"/>
+            </w:tcMar>
+            <w:vAlign w:val="center"/>
+          </w:tcPr>
+          <w:p>
+            <w:pPr>
+              <w:jc w:val="center"/>
+              <w:rPr>
+                <w:highlight w:val="white"/>
+              </w:rPr>
+            </w:pPr>
+            <w:r>
+              <w:rPr>
+                <w:highlight w:val="white"/>
+              </w:rPr>
+              <w:t>1.010</w:t>
+            </w:r>
+          </w:p>
+        </w:tc>
+        <w:tc>
+          <w:tcPr>
+            <w:tcW w:w="2714" w:type="dxa"/>
+            <w:tcBorders>
+              <w:top w:val="nil"/>
+              <w:left w:val="nil"/>
               <w:bottom w:val="single" w:sz="4" w:space="0" w:color="auto"/>
               <w:right w:val="single" w:sz="4" w:space="0" w:color="auto"/>
             </w:tcBorders>
@@ -26552,18 +27449,21 @@
               </w:rPr>
             </w:pPr>
             <w:r>
-              <w:t>Minimum</w:t>
-            </w:r>
-          </w:p>
-        </w:tc>
-        <w:tc>
-          <w:tcPr>
-            <w:tcW w:w="2714" w:type="dxa"/>
+              <w:rPr>
+                <w:highlight w:val="white"/>
+              </w:rPr>
+              <w:t>1.140</w:t>
+            </w:r>
+          </w:p>
+        </w:tc>
+        <w:tc>
+          <w:tcPr>
+            <w:tcW w:w="2715" w:type="dxa"/>
             <w:tcBorders>
-              <w:top w:val="single" w:sz="4" w:space="0" w:color="auto"/>
+              <w:top w:val="nil"/>
               <w:left w:val="single" w:sz="4" w:space="0" w:color="auto"/>
               <w:bottom w:val="single" w:sz="4" w:space="0" w:color="auto"/>
-              <w:right w:val="single" w:sz="4" w:space="0" w:color="auto"/>
+              <w:right w:val="nil"/>
             </w:tcBorders>
             <w:shd w:val="clear" w:color="auto" w:fill="auto"/>
             <w:tcMar>
@@ -26585,40 +27485,7 @@
               <w:rPr>
                 <w:highlight w:val="white"/>
               </w:rPr>
-              <w:t>0.000</w:t>
-            </w:r>
-          </w:p>
-        </w:tc>
-        <w:tc>
-          <w:tcPr>
-            <w:tcW w:w="2714" w:type="dxa"/>
-            <w:tcBorders>
-              <w:top w:val="single" w:sz="4" w:space="0" w:color="auto"/>
-              <w:left w:val="single" w:sz="4" w:space="0" w:color="auto"/>
-              <w:bottom w:val="single" w:sz="4" w:space="0" w:color="auto"/>
-              <w:right w:val="single" w:sz="4" w:space="0" w:color="auto"/>
-            </w:tcBorders>
-            <w:shd w:val="clear" w:color="auto" w:fill="auto"/>
-            <w:tcMar>
-              <w:top w:w="100" w:type="dxa"/>
-              <w:left w:w="576" w:type="dxa"/>
-              <w:bottom w:w="100" w:type="dxa"/>
-              <w:right w:w="576" w:type="dxa"/>
-            </w:tcMar>
-            <w:vAlign w:val="center"/>
-          </w:tcPr>
-          <w:p>
-            <w:pPr>
-              <w:jc w:val="center"/>
-              <w:rPr>
-                <w:highlight w:val="white"/>
-              </w:rPr>
-            </w:pPr>
-            <w:r>
-              <w:rPr>
-                <w:highlight w:val="white"/>
-              </w:rPr>
-              <w:t>0.163</w:t>
+              <w:t>0.972</w:t>
             </w:r>
           </w:p>
         </w:tc>
@@ -26626,863 +27493,8 @@
           <w:tcPr>
             <w:tcW w:w="2715" w:type="dxa"/>
             <w:tcBorders>
-              <w:top w:val="single" w:sz="4" w:space="0" w:color="auto"/>
-              <w:left w:val="single" w:sz="4" w:space="0" w:color="auto"/>
-              <w:bottom w:val="single" w:sz="4" w:space="0" w:color="auto"/>
-              <w:right w:val="single" w:sz="4" w:space="0" w:color="auto"/>
-            </w:tcBorders>
-            <w:shd w:val="clear" w:color="auto" w:fill="auto"/>
-            <w:tcMar>
-              <w:top w:w="100" w:type="dxa"/>
-              <w:left w:w="576" w:type="dxa"/>
-              <w:bottom w:w="100" w:type="dxa"/>
-              <w:right w:w="576" w:type="dxa"/>
-            </w:tcMar>
-            <w:vAlign w:val="center"/>
-          </w:tcPr>
-          <w:p>
-            <w:pPr>
-              <w:jc w:val="center"/>
-              <w:rPr>
-                <w:highlight w:val="white"/>
-              </w:rPr>
-            </w:pPr>
-            <w:r>
-              <w:rPr>
-                <w:highlight w:val="white"/>
-              </w:rPr>
-              <w:t>0.000</w:t>
-            </w:r>
-          </w:p>
-        </w:tc>
-        <w:tc>
-          <w:tcPr>
-            <w:tcW w:w="2715" w:type="dxa"/>
-            <w:tcBorders>
-              <w:top w:val="single" w:sz="4" w:space="0" w:color="auto"/>
-              <w:left w:val="single" w:sz="4" w:space="0" w:color="auto"/>
-              <w:bottom w:val="single" w:sz="4" w:space="0" w:color="auto"/>
-              <w:right w:val="single" w:sz="4" w:space="0" w:color="auto"/>
-            </w:tcBorders>
-            <w:shd w:val="clear" w:color="auto" w:fill="auto"/>
-            <w:tcMar>
-              <w:top w:w="100" w:type="dxa"/>
-              <w:left w:w="576" w:type="dxa"/>
-              <w:bottom w:w="100" w:type="dxa"/>
-              <w:right w:w="576" w:type="dxa"/>
-            </w:tcMar>
-            <w:vAlign w:val="center"/>
-          </w:tcPr>
-          <w:p>
-            <w:pPr>
-              <w:jc w:val="center"/>
-              <w:rPr>
-                <w:highlight w:val="white"/>
-              </w:rPr>
-            </w:pPr>
-            <w:r>
-              <w:rPr>
-                <w:highlight w:val="white"/>
-              </w:rPr>
-              <w:t>0.163</w:t>
-            </w:r>
-          </w:p>
-        </w:tc>
-      </w:tr>
-      <w:tr>
-        <w:tc>
-          <w:tcPr>
-            <w:tcW w:w="2730" w:type="dxa"/>
-            <w:tcBorders>
-              <w:top w:val="single" w:sz="4" w:space="0" w:color="auto"/>
-              <w:left w:val="single" w:sz="4" w:space="0" w:color="auto"/>
-              <w:bottom w:val="single" w:sz="4" w:space="0" w:color="auto"/>
-              <w:right w:val="single" w:sz="4" w:space="0" w:color="auto"/>
-            </w:tcBorders>
-            <w:tcMar>
-              <w:top w:w="0" w:type="dxa"/>
-              <w:left w:w="576" w:type="dxa"/>
-              <w:bottom w:w="0" w:type="dxa"/>
-              <w:right w:w="576" w:type="dxa"/>
-            </w:tcMar>
-            <w:vAlign w:val="center"/>
-          </w:tcPr>
-          <w:p>
-            <w:pPr>
-              <w:jc w:val="center"/>
-            </w:pPr>
-            <w:r>
-              <w:t>1</w:t>
-            </w:r>
-            <w:r>
-              <w:rPr>
-                <w:vertAlign w:val="superscript"/>
-              </w:rPr>
-              <w:t>st</w:t>
-            </w:r>
-            <w:r>
-              <w:t xml:space="preserve"> Quartile</w:t>
-            </w:r>
-          </w:p>
-        </w:tc>
-        <w:tc>
-          <w:tcPr>
-            <w:tcW w:w="2714" w:type="dxa"/>
-            <w:tcBorders>
-              <w:top w:val="single" w:sz="4" w:space="0" w:color="auto"/>
-              <w:left w:val="single" w:sz="4" w:space="0" w:color="auto"/>
-              <w:bottom w:val="single" w:sz="4" w:space="0" w:color="auto"/>
-              <w:right w:val="single" w:sz="4" w:space="0" w:color="auto"/>
-            </w:tcBorders>
-            <w:shd w:val="clear" w:color="auto" w:fill="auto"/>
-            <w:tcMar>
-              <w:top w:w="100" w:type="dxa"/>
-              <w:left w:w="576" w:type="dxa"/>
-              <w:bottom w:w="100" w:type="dxa"/>
-              <w:right w:w="576" w:type="dxa"/>
-            </w:tcMar>
-            <w:vAlign w:val="center"/>
-          </w:tcPr>
-          <w:p>
-            <w:pPr>
-              <w:jc w:val="center"/>
-              <w:rPr>
-                <w:highlight w:val="white"/>
-              </w:rPr>
-            </w:pPr>
-            <w:r>
-              <w:rPr>
-                <w:highlight w:val="white"/>
-              </w:rPr>
-              <w:t>0.442</w:t>
-            </w:r>
-          </w:p>
-        </w:tc>
-        <w:tc>
-          <w:tcPr>
-            <w:tcW w:w="2714" w:type="dxa"/>
-            <w:tcBorders>
-              <w:top w:val="single" w:sz="4" w:space="0" w:color="auto"/>
-              <w:left w:val="single" w:sz="4" w:space="0" w:color="auto"/>
-              <w:bottom w:val="single" w:sz="4" w:space="0" w:color="auto"/>
-              <w:right w:val="single" w:sz="4" w:space="0" w:color="auto"/>
-            </w:tcBorders>
-            <w:shd w:val="clear" w:color="auto" w:fill="auto"/>
-            <w:tcMar>
-              <w:top w:w="100" w:type="dxa"/>
-              <w:left w:w="576" w:type="dxa"/>
-              <w:bottom w:w="100" w:type="dxa"/>
-              <w:right w:w="576" w:type="dxa"/>
-            </w:tcMar>
-            <w:vAlign w:val="center"/>
-          </w:tcPr>
-          <w:p>
-            <w:pPr>
-              <w:jc w:val="center"/>
-              <w:rPr>
-                <w:highlight w:val="white"/>
-              </w:rPr>
-            </w:pPr>
-            <w:r>
-              <w:rPr>
-                <w:highlight w:val="white"/>
-              </w:rPr>
-              <w:t>0.628</w:t>
-            </w:r>
-          </w:p>
-        </w:tc>
-        <w:tc>
-          <w:tcPr>
-            <w:tcW w:w="2715" w:type="dxa"/>
-            <w:tcBorders>
-              <w:top w:val="single" w:sz="4" w:space="0" w:color="auto"/>
-              <w:left w:val="single" w:sz="4" w:space="0" w:color="auto"/>
-              <w:bottom w:val="single" w:sz="4" w:space="0" w:color="auto"/>
-              <w:right w:val="single" w:sz="4" w:space="0" w:color="auto"/>
-            </w:tcBorders>
-            <w:shd w:val="clear" w:color="auto" w:fill="auto"/>
-            <w:tcMar>
-              <w:top w:w="100" w:type="dxa"/>
-              <w:left w:w="576" w:type="dxa"/>
-              <w:bottom w:w="100" w:type="dxa"/>
-              <w:right w:w="576" w:type="dxa"/>
-            </w:tcMar>
-            <w:vAlign w:val="center"/>
-          </w:tcPr>
-          <w:p>
-            <w:pPr>
-              <w:jc w:val="center"/>
-              <w:rPr>
-                <w:highlight w:val="white"/>
-              </w:rPr>
-            </w:pPr>
-            <w:r>
-              <w:rPr>
-                <w:highlight w:val="white"/>
-              </w:rPr>
-              <w:t>0.418</w:t>
-            </w:r>
-          </w:p>
-        </w:tc>
-        <w:tc>
-          <w:tcPr>
-            <w:tcW w:w="2715" w:type="dxa"/>
-            <w:tcBorders>
-              <w:top w:val="single" w:sz="4" w:space="0" w:color="auto"/>
-              <w:left w:val="single" w:sz="4" w:space="0" w:color="auto"/>
-              <w:bottom w:val="single" w:sz="4" w:space="0" w:color="auto"/>
-              <w:right w:val="single" w:sz="4" w:space="0" w:color="auto"/>
-            </w:tcBorders>
-            <w:shd w:val="clear" w:color="auto" w:fill="auto"/>
-            <w:tcMar>
-              <w:top w:w="100" w:type="dxa"/>
-              <w:left w:w="576" w:type="dxa"/>
-              <w:bottom w:w="100" w:type="dxa"/>
-              <w:right w:w="576" w:type="dxa"/>
-            </w:tcMar>
-            <w:vAlign w:val="center"/>
-          </w:tcPr>
-          <w:p>
-            <w:pPr>
-              <w:jc w:val="center"/>
-              <w:rPr>
-                <w:highlight w:val="white"/>
-              </w:rPr>
-            </w:pPr>
-            <w:r>
-              <w:rPr>
-                <w:highlight w:val="white"/>
-              </w:rPr>
-              <w:t>0.603</w:t>
-            </w:r>
-          </w:p>
-        </w:tc>
-      </w:tr>
-      <w:tr>
-        <w:tc>
-          <w:tcPr>
-            <w:tcW w:w="2730" w:type="dxa"/>
-            <w:tcBorders>
-              <w:top w:val="single" w:sz="4" w:space="0" w:color="auto"/>
-              <w:left w:val="single" w:sz="4" w:space="0" w:color="auto"/>
-              <w:bottom w:val="single" w:sz="4" w:space="0" w:color="auto"/>
-              <w:right w:val="single" w:sz="4" w:space="0" w:color="auto"/>
-            </w:tcBorders>
-            <w:tcMar>
-              <w:top w:w="0" w:type="dxa"/>
-              <w:left w:w="576" w:type="dxa"/>
-              <w:bottom w:w="0" w:type="dxa"/>
-              <w:right w:w="576" w:type="dxa"/>
-            </w:tcMar>
-            <w:vAlign w:val="center"/>
-          </w:tcPr>
-          <w:p>
-            <w:pPr>
-              <w:jc w:val="center"/>
-            </w:pPr>
-            <w:r>
-              <w:t>Median</w:t>
-            </w:r>
-          </w:p>
-        </w:tc>
-        <w:tc>
-          <w:tcPr>
-            <w:tcW w:w="2714" w:type="dxa"/>
-            <w:tcBorders>
-              <w:top w:val="single" w:sz="4" w:space="0" w:color="auto"/>
-              <w:left w:val="single" w:sz="4" w:space="0" w:color="auto"/>
-              <w:bottom w:val="single" w:sz="4" w:space="0" w:color="auto"/>
-              <w:right w:val="single" w:sz="4" w:space="0" w:color="auto"/>
-            </w:tcBorders>
-            <w:shd w:val="clear" w:color="auto" w:fill="auto"/>
-            <w:tcMar>
-              <w:top w:w="100" w:type="dxa"/>
-              <w:left w:w="576" w:type="dxa"/>
-              <w:bottom w:w="100" w:type="dxa"/>
-              <w:right w:w="576" w:type="dxa"/>
-            </w:tcMar>
-            <w:vAlign w:val="center"/>
-          </w:tcPr>
-          <w:p>
-            <w:pPr>
-              <w:jc w:val="center"/>
-              <w:rPr>
-                <w:highlight w:val="white"/>
-              </w:rPr>
-            </w:pPr>
-            <w:r>
-              <w:rPr>
-                <w:highlight w:val="white"/>
-              </w:rPr>
-              <w:t>0.574</w:t>
-            </w:r>
-          </w:p>
-        </w:tc>
-        <w:tc>
-          <w:tcPr>
-            <w:tcW w:w="2714" w:type="dxa"/>
-            <w:tcBorders>
-              <w:top w:val="single" w:sz="4" w:space="0" w:color="auto"/>
-              <w:left w:val="single" w:sz="4" w:space="0" w:color="auto"/>
-              <w:bottom w:val="single" w:sz="4" w:space="0" w:color="auto"/>
-              <w:right w:val="single" w:sz="4" w:space="0" w:color="auto"/>
-            </w:tcBorders>
-            <w:shd w:val="clear" w:color="auto" w:fill="auto"/>
-            <w:tcMar>
-              <w:top w:w="100" w:type="dxa"/>
-              <w:left w:w="576" w:type="dxa"/>
-              <w:bottom w:w="100" w:type="dxa"/>
-              <w:right w:w="576" w:type="dxa"/>
-            </w:tcMar>
-            <w:vAlign w:val="center"/>
-          </w:tcPr>
-          <w:p>
-            <w:pPr>
-              <w:jc w:val="center"/>
-              <w:rPr>
-                <w:highlight w:val="white"/>
-              </w:rPr>
-            </w:pPr>
-            <w:r>
-              <w:rPr>
-                <w:highlight w:val="white"/>
-              </w:rPr>
-              <w:t>0.736</w:t>
-            </w:r>
-          </w:p>
-        </w:tc>
-        <w:tc>
-          <w:tcPr>
-            <w:tcW w:w="2715" w:type="dxa"/>
-            <w:tcBorders>
-              <w:top w:val="single" w:sz="4" w:space="0" w:color="auto"/>
-              <w:left w:val="single" w:sz="4" w:space="0" w:color="auto"/>
-              <w:bottom w:val="single" w:sz="4" w:space="0" w:color="auto"/>
-              <w:right w:val="single" w:sz="4" w:space="0" w:color="auto"/>
-            </w:tcBorders>
-            <w:shd w:val="clear" w:color="auto" w:fill="auto"/>
-            <w:tcMar>
-              <w:top w:w="100" w:type="dxa"/>
-              <w:left w:w="576" w:type="dxa"/>
-              <w:bottom w:w="100" w:type="dxa"/>
-              <w:right w:w="576" w:type="dxa"/>
-            </w:tcMar>
-            <w:vAlign w:val="center"/>
-          </w:tcPr>
-          <w:p>
-            <w:pPr>
-              <w:jc w:val="center"/>
-              <w:rPr>
-                <w:highlight w:val="white"/>
-              </w:rPr>
-            </w:pPr>
-            <w:r>
-              <w:rPr>
-                <w:highlight w:val="white"/>
-              </w:rPr>
-              <w:t>0.548</w:t>
-            </w:r>
-          </w:p>
-        </w:tc>
-        <w:tc>
-          <w:tcPr>
-            <w:tcW w:w="2715" w:type="dxa"/>
-            <w:tcBorders>
-              <w:top w:val="single" w:sz="4" w:space="0" w:color="auto"/>
-              <w:left w:val="single" w:sz="4" w:space="0" w:color="auto"/>
-              <w:bottom w:val="single" w:sz="4" w:space="0" w:color="auto"/>
-              <w:right w:val="single" w:sz="4" w:space="0" w:color="auto"/>
-            </w:tcBorders>
-            <w:shd w:val="clear" w:color="auto" w:fill="auto"/>
-            <w:tcMar>
-              <w:top w:w="100" w:type="dxa"/>
-              <w:left w:w="576" w:type="dxa"/>
-              <w:bottom w:w="100" w:type="dxa"/>
-              <w:right w:w="576" w:type="dxa"/>
-            </w:tcMar>
-            <w:vAlign w:val="center"/>
-          </w:tcPr>
-          <w:p>
-            <w:pPr>
-              <w:jc w:val="center"/>
-              <w:rPr>
-                <w:highlight w:val="white"/>
-              </w:rPr>
-            </w:pPr>
-            <w:r>
-              <w:rPr>
-                <w:highlight w:val="white"/>
-              </w:rPr>
-              <w:t>0.719</w:t>
-            </w:r>
-          </w:p>
-        </w:tc>
-      </w:tr>
-      <w:tr>
-        <w:tc>
-          <w:tcPr>
-            <w:tcW w:w="2730" w:type="dxa"/>
-            <w:tcBorders>
-              <w:top w:val="single" w:sz="4" w:space="0" w:color="auto"/>
-              <w:left w:val="single" w:sz="4" w:space="0" w:color="auto"/>
-              <w:bottom w:val="single" w:sz="4" w:space="0" w:color="auto"/>
-              <w:right w:val="single" w:sz="4" w:space="0" w:color="auto"/>
-            </w:tcBorders>
-            <w:shd w:val="clear" w:color="auto" w:fill="auto"/>
-            <w:tcMar>
-              <w:top w:w="100" w:type="dxa"/>
-              <w:left w:w="576" w:type="dxa"/>
-              <w:bottom w:w="100" w:type="dxa"/>
-              <w:right w:w="576" w:type="dxa"/>
-            </w:tcMar>
-            <w:vAlign w:val="center"/>
-          </w:tcPr>
-          <w:p>
-            <w:pPr>
-              <w:jc w:val="center"/>
-              <w:rPr>
-                <w:highlight w:val="white"/>
-              </w:rPr>
-            </w:pPr>
-            <w:r>
-              <w:t>Mean</w:t>
-            </w:r>
-          </w:p>
-        </w:tc>
-        <w:tc>
-          <w:tcPr>
-            <w:tcW w:w="2714" w:type="dxa"/>
-            <w:tcBorders>
-              <w:top w:val="single" w:sz="4" w:space="0" w:color="auto"/>
-              <w:left w:val="single" w:sz="4" w:space="0" w:color="auto"/>
-              <w:bottom w:val="single" w:sz="4" w:space="0" w:color="auto"/>
-              <w:right w:val="single" w:sz="4" w:space="0" w:color="auto"/>
-            </w:tcBorders>
-            <w:shd w:val="clear" w:color="auto" w:fill="auto"/>
-            <w:tcMar>
-              <w:top w:w="100" w:type="dxa"/>
-              <w:left w:w="576" w:type="dxa"/>
-              <w:bottom w:w="100" w:type="dxa"/>
-              <w:right w:w="576" w:type="dxa"/>
-            </w:tcMar>
-            <w:vAlign w:val="center"/>
-          </w:tcPr>
-          <w:p>
-            <w:pPr>
-              <w:jc w:val="center"/>
-              <w:rPr>
-                <w:highlight w:val="white"/>
-              </w:rPr>
-            </w:pPr>
-            <w:r>
-              <w:rPr>
-                <w:highlight w:val="white"/>
-              </w:rPr>
-              <w:t>0.553</w:t>
-            </w:r>
-          </w:p>
-        </w:tc>
-        <w:tc>
-          <w:tcPr>
-            <w:tcW w:w="2714" w:type="dxa"/>
-            <w:tcBorders>
-              <w:top w:val="single" w:sz="4" w:space="0" w:color="auto"/>
-              <w:left w:val="single" w:sz="4" w:space="0" w:color="auto"/>
-              <w:bottom w:val="single" w:sz="4" w:space="0" w:color="auto"/>
-              <w:right w:val="single" w:sz="4" w:space="0" w:color="auto"/>
-            </w:tcBorders>
-            <w:shd w:val="clear" w:color="auto" w:fill="auto"/>
-            <w:tcMar>
-              <w:top w:w="100" w:type="dxa"/>
-              <w:left w:w="576" w:type="dxa"/>
-              <w:bottom w:w="100" w:type="dxa"/>
-              <w:right w:w="576" w:type="dxa"/>
-            </w:tcMar>
-            <w:vAlign w:val="center"/>
-          </w:tcPr>
-          <w:p>
-            <w:pPr>
-              <w:jc w:val="center"/>
-              <w:rPr>
-                <w:highlight w:val="white"/>
-              </w:rPr>
-            </w:pPr>
-            <w:r>
-              <w:rPr>
-                <w:highlight w:val="white"/>
-              </w:rPr>
-              <w:t>0.729</w:t>
-            </w:r>
-          </w:p>
-        </w:tc>
-        <w:tc>
-          <w:tcPr>
-            <w:tcW w:w="2715" w:type="dxa"/>
-            <w:tcBorders>
-              <w:top w:val="single" w:sz="4" w:space="0" w:color="auto"/>
-              <w:left w:val="single" w:sz="4" w:space="0" w:color="auto"/>
-              <w:bottom w:val="single" w:sz="4" w:space="0" w:color="auto"/>
-              <w:right w:val="single" w:sz="4" w:space="0" w:color="auto"/>
-            </w:tcBorders>
-            <w:shd w:val="clear" w:color="auto" w:fill="auto"/>
-            <w:tcMar>
-              <w:top w:w="100" w:type="dxa"/>
-              <w:left w:w="576" w:type="dxa"/>
-              <w:bottom w:w="100" w:type="dxa"/>
-              <w:right w:w="576" w:type="dxa"/>
-            </w:tcMar>
-            <w:vAlign w:val="center"/>
-          </w:tcPr>
-          <w:p>
-            <w:pPr>
-              <w:jc w:val="center"/>
-              <w:rPr>
-                <w:highlight w:val="white"/>
-              </w:rPr>
-            </w:pPr>
-            <w:r>
-              <w:rPr>
-                <w:highlight w:val="white"/>
-              </w:rPr>
-              <w:t>0.521</w:t>
-            </w:r>
-          </w:p>
-        </w:tc>
-        <w:tc>
-          <w:tcPr>
-            <w:tcW w:w="2715" w:type="dxa"/>
-            <w:tcBorders>
-              <w:top w:val="single" w:sz="4" w:space="0" w:color="auto"/>
-              <w:left w:val="single" w:sz="4" w:space="0" w:color="auto"/>
-              <w:bottom w:val="single" w:sz="4" w:space="0" w:color="auto"/>
-              <w:right w:val="single" w:sz="4" w:space="0" w:color="auto"/>
-            </w:tcBorders>
-            <w:shd w:val="clear" w:color="auto" w:fill="auto"/>
-            <w:tcMar>
-              <w:top w:w="100" w:type="dxa"/>
-              <w:left w:w="576" w:type="dxa"/>
-              <w:bottom w:w="100" w:type="dxa"/>
-              <w:right w:w="576" w:type="dxa"/>
-            </w:tcMar>
-            <w:vAlign w:val="center"/>
-          </w:tcPr>
-          <w:p>
-            <w:pPr>
-              <w:jc w:val="center"/>
-              <w:rPr>
-                <w:highlight w:val="white"/>
-              </w:rPr>
-            </w:pPr>
-            <w:r>
-              <w:rPr>
-                <w:highlight w:val="white"/>
-              </w:rPr>
-              <w:t>0.708</w:t>
-            </w:r>
-          </w:p>
-        </w:tc>
-      </w:tr>
-      <w:tr>
-        <w:tc>
-          <w:tcPr>
-            <w:tcW w:w="2730" w:type="dxa"/>
-            <w:tcBorders>
-              <w:top w:val="single" w:sz="4" w:space="0" w:color="auto"/>
-              <w:left w:val="single" w:sz="4" w:space="0" w:color="auto"/>
-              <w:bottom w:val="single" w:sz="4" w:space="0" w:color="auto"/>
-              <w:right w:val="single" w:sz="4" w:space="0" w:color="auto"/>
-            </w:tcBorders>
-            <w:tcMar>
-              <w:top w:w="0" w:type="dxa"/>
-              <w:left w:w="576" w:type="dxa"/>
-              <w:bottom w:w="0" w:type="dxa"/>
-              <w:right w:w="576" w:type="dxa"/>
-            </w:tcMar>
-            <w:vAlign w:val="center"/>
-          </w:tcPr>
-          <w:p>
-            <w:pPr>
-              <w:jc w:val="center"/>
-            </w:pPr>
-            <w:r>
-              <w:t>3</w:t>
-            </w:r>
-            <w:r>
-              <w:rPr>
-                <w:vertAlign w:val="superscript"/>
-              </w:rPr>
-              <w:t>rd</w:t>
-            </w:r>
-            <w:r>
-              <w:t xml:space="preserve"> Quartile</w:t>
-            </w:r>
-          </w:p>
-        </w:tc>
-        <w:tc>
-          <w:tcPr>
-            <w:tcW w:w="2714" w:type="dxa"/>
-            <w:tcBorders>
-              <w:top w:val="single" w:sz="4" w:space="0" w:color="auto"/>
-              <w:left w:val="single" w:sz="4" w:space="0" w:color="auto"/>
-              <w:bottom w:val="single" w:sz="4" w:space="0" w:color="auto"/>
-              <w:right w:val="single" w:sz="4" w:space="0" w:color="auto"/>
-            </w:tcBorders>
-            <w:shd w:val="clear" w:color="auto" w:fill="auto"/>
-            <w:tcMar>
-              <w:top w:w="100" w:type="dxa"/>
-              <w:left w:w="576" w:type="dxa"/>
-              <w:bottom w:w="100" w:type="dxa"/>
-              <w:right w:w="576" w:type="dxa"/>
-            </w:tcMar>
-            <w:vAlign w:val="center"/>
-          </w:tcPr>
-          <w:p>
-            <w:pPr>
-              <w:jc w:val="center"/>
-              <w:rPr>
-                <w:highlight w:val="white"/>
-              </w:rPr>
-            </w:pPr>
-            <w:r>
-              <w:rPr>
-                <w:highlight w:val="white"/>
-              </w:rPr>
-              <w:t>0.700</w:t>
-            </w:r>
-          </w:p>
-        </w:tc>
-        <w:tc>
-          <w:tcPr>
-            <w:tcW w:w="2714" w:type="dxa"/>
-            <w:tcBorders>
-              <w:top w:val="single" w:sz="4" w:space="0" w:color="auto"/>
-              <w:left w:val="single" w:sz="4" w:space="0" w:color="auto"/>
-              <w:bottom w:val="single" w:sz="4" w:space="0" w:color="auto"/>
-              <w:right w:val="single" w:sz="4" w:space="0" w:color="auto"/>
-            </w:tcBorders>
-            <w:shd w:val="clear" w:color="auto" w:fill="auto"/>
-            <w:tcMar>
-              <w:top w:w="100" w:type="dxa"/>
-              <w:left w:w="576" w:type="dxa"/>
-              <w:bottom w:w="100" w:type="dxa"/>
-              <w:right w:w="576" w:type="dxa"/>
-            </w:tcMar>
-            <w:vAlign w:val="center"/>
-          </w:tcPr>
-          <w:p>
-            <w:pPr>
-              <w:jc w:val="center"/>
-              <w:rPr>
-                <w:highlight w:val="white"/>
-              </w:rPr>
-            </w:pPr>
-            <w:r>
-              <w:rPr>
-                <w:highlight w:val="white"/>
-              </w:rPr>
-              <w:t>0.828</w:t>
-            </w:r>
-          </w:p>
-        </w:tc>
-        <w:tc>
-          <w:tcPr>
-            <w:tcW w:w="2715" w:type="dxa"/>
-            <w:tcBorders>
-              <w:top w:val="single" w:sz="4" w:space="0" w:color="auto"/>
-              <w:left w:val="single" w:sz="4" w:space="0" w:color="auto"/>
-              <w:bottom w:val="single" w:sz="4" w:space="0" w:color="auto"/>
-              <w:right w:val="single" w:sz="4" w:space="0" w:color="auto"/>
-            </w:tcBorders>
-            <w:shd w:val="clear" w:color="auto" w:fill="auto"/>
-            <w:tcMar>
-              <w:top w:w="100" w:type="dxa"/>
-              <w:left w:w="576" w:type="dxa"/>
-              <w:bottom w:w="100" w:type="dxa"/>
-              <w:right w:w="576" w:type="dxa"/>
-            </w:tcMar>
-            <w:vAlign w:val="center"/>
-          </w:tcPr>
-          <w:p>
-            <w:pPr>
-              <w:jc w:val="center"/>
-              <w:rPr>
-                <w:highlight w:val="white"/>
-              </w:rPr>
-            </w:pPr>
-            <w:r>
-              <w:rPr>
-                <w:highlight w:val="white"/>
-              </w:rPr>
-              <w:t>0.669</w:t>
-            </w:r>
-          </w:p>
-        </w:tc>
-        <w:tc>
-          <w:tcPr>
-            <w:tcW w:w="2715" w:type="dxa"/>
-            <w:tcBorders>
-              <w:top w:val="single" w:sz="4" w:space="0" w:color="auto"/>
-              <w:left w:val="single" w:sz="4" w:space="0" w:color="auto"/>
-              <w:bottom w:val="single" w:sz="4" w:space="0" w:color="auto"/>
-              <w:right w:val="single" w:sz="4" w:space="0" w:color="auto"/>
-            </w:tcBorders>
-            <w:shd w:val="clear" w:color="auto" w:fill="auto"/>
-            <w:tcMar>
-              <w:top w:w="100" w:type="dxa"/>
-              <w:left w:w="576" w:type="dxa"/>
-              <w:bottom w:w="100" w:type="dxa"/>
-              <w:right w:w="576" w:type="dxa"/>
-            </w:tcMar>
-            <w:vAlign w:val="center"/>
-          </w:tcPr>
-          <w:p>
-            <w:pPr>
-              <w:jc w:val="center"/>
-              <w:rPr>
-                <w:highlight w:val="white"/>
-              </w:rPr>
-            </w:pPr>
-            <w:r>
-              <w:rPr>
-                <w:highlight w:val="white"/>
-              </w:rPr>
-              <w:t>0.817</w:t>
-            </w:r>
-          </w:p>
-        </w:tc>
-      </w:tr>
-      <w:tr>
-        <w:tc>
-          <w:tcPr>
-            <w:tcW w:w="2730" w:type="dxa"/>
-            <w:tcBorders>
-              <w:top w:val="single" w:sz="4" w:space="0" w:color="auto"/>
-              <w:left w:val="single" w:sz="4" w:space="0" w:color="auto"/>
-              <w:bottom w:val="single" w:sz="4" w:space="0" w:color="auto"/>
-              <w:right w:val="single" w:sz="4" w:space="0" w:color="auto"/>
-            </w:tcBorders>
-            <w:tcMar>
-              <w:top w:w="0" w:type="dxa"/>
-              <w:left w:w="576" w:type="dxa"/>
-              <w:bottom w:w="0" w:type="dxa"/>
-              <w:right w:w="576" w:type="dxa"/>
-            </w:tcMar>
-            <w:vAlign w:val="center"/>
-          </w:tcPr>
-          <w:p>
-            <w:pPr>
-              <w:jc w:val="center"/>
-            </w:pPr>
-            <w:r>
-              <w:t>Maximum</w:t>
-            </w:r>
-          </w:p>
-        </w:tc>
-        <w:tc>
-          <w:tcPr>
-            <w:tcW w:w="2714" w:type="dxa"/>
-            <w:tcBorders>
-              <w:top w:val="single" w:sz="4" w:space="0" w:color="auto"/>
-              <w:left w:val="single" w:sz="4" w:space="0" w:color="auto"/>
-              <w:bottom w:val="single" w:sz="4" w:space="0" w:color="auto"/>
-              <w:right w:val="single" w:sz="4" w:space="0" w:color="auto"/>
-            </w:tcBorders>
-            <w:shd w:val="clear" w:color="auto" w:fill="auto"/>
-            <w:tcMar>
-              <w:top w:w="100" w:type="dxa"/>
-              <w:left w:w="576" w:type="dxa"/>
-              <w:bottom w:w="100" w:type="dxa"/>
-              <w:right w:w="576" w:type="dxa"/>
-            </w:tcMar>
-            <w:vAlign w:val="center"/>
-          </w:tcPr>
-          <w:p>
-            <w:pPr>
-              <w:jc w:val="center"/>
-              <w:rPr>
-                <w:highlight w:val="white"/>
-              </w:rPr>
-            </w:pPr>
-            <w:r>
-              <w:rPr>
-                <w:highlight w:val="white"/>
-              </w:rPr>
-              <w:t>1.010</w:t>
-            </w:r>
-          </w:p>
-        </w:tc>
-        <w:tc>
-          <w:tcPr>
-            <w:tcW w:w="2714" w:type="dxa"/>
-            <w:tcBorders>
-              <w:top w:val="single" w:sz="4" w:space="0" w:color="auto"/>
-              <w:left w:val="single" w:sz="4" w:space="0" w:color="auto"/>
-              <w:bottom w:val="single" w:sz="4" w:space="0" w:color="auto"/>
-              <w:right w:val="single" w:sz="4" w:space="0" w:color="auto"/>
-            </w:tcBorders>
-            <w:shd w:val="clear" w:color="auto" w:fill="auto"/>
-            <w:tcMar>
-              <w:top w:w="100" w:type="dxa"/>
-              <w:left w:w="576" w:type="dxa"/>
-              <w:bottom w:w="100" w:type="dxa"/>
-              <w:right w:w="576" w:type="dxa"/>
-            </w:tcMar>
-            <w:vAlign w:val="center"/>
-          </w:tcPr>
-          <w:p>
-            <w:pPr>
-              <w:jc w:val="center"/>
-              <w:rPr>
-                <w:highlight w:val="white"/>
-              </w:rPr>
-            </w:pPr>
-            <w:r>
-              <w:rPr>
-                <w:highlight w:val="white"/>
-              </w:rPr>
-              <w:t>1.140</w:t>
-            </w:r>
-          </w:p>
-        </w:tc>
-        <w:tc>
-          <w:tcPr>
-            <w:tcW w:w="2715" w:type="dxa"/>
-            <w:tcBorders>
-              <w:top w:val="single" w:sz="4" w:space="0" w:color="auto"/>
-              <w:left w:val="single" w:sz="4" w:space="0" w:color="auto"/>
-              <w:bottom w:val="single" w:sz="4" w:space="0" w:color="auto"/>
-              <w:right w:val="single" w:sz="4" w:space="0" w:color="auto"/>
-            </w:tcBorders>
-            <w:shd w:val="clear" w:color="auto" w:fill="auto"/>
-            <w:tcMar>
-              <w:top w:w="100" w:type="dxa"/>
-              <w:left w:w="576" w:type="dxa"/>
-              <w:bottom w:w="100" w:type="dxa"/>
-              <w:right w:w="576" w:type="dxa"/>
-            </w:tcMar>
-            <w:vAlign w:val="center"/>
-          </w:tcPr>
-          <w:p>
-            <w:pPr>
-              <w:jc w:val="center"/>
-              <w:rPr>
-                <w:highlight w:val="white"/>
-              </w:rPr>
-            </w:pPr>
-            <w:r>
-              <w:rPr>
-                <w:highlight w:val="white"/>
-              </w:rPr>
-              <w:t>0.972</w:t>
-            </w:r>
-          </w:p>
-        </w:tc>
-        <w:tc>
-          <w:tcPr>
-            <w:tcW w:w="2715" w:type="dxa"/>
-            <w:tcBorders>
-              <w:top w:val="single" w:sz="4" w:space="0" w:color="auto"/>
-              <w:left w:val="single" w:sz="4" w:space="0" w:color="auto"/>
+              <w:top w:val="nil"/>
+              <w:left w:val="nil"/>
               <w:bottom w:val="single" w:sz="4" w:space="0" w:color="auto"/>
               <w:right w:val="single" w:sz="4" w:space="0" w:color="auto"/>
             </w:tcBorders>

</xml_diff>